<commit_message>
Shorten lesson report and remove decorative spreadsheet formatting
Co-authored-by: arena-agent <297053741+arena-agent@users.noreply.github.com>
</commit_message>
<xml_diff>
--- a/Результат/Отчёт_по_уроку.docx
+++ b/Результат/Отчёт_по_уроку.docx
@@ -7,154 +7,12 @@
         <w:pStyle w:val="Title"/>
       </w:pPr>
       <w:r>
-        <w:t>ОТЧЁТ ПО ПРАКТИЧЕСКОЙ РАБОТЕ</w:t>
-      </w:r>
-    </w:p>
-    <w:p>
-      <w:pPr>
-        <w:pStyle w:val="Heading1"/>
-      </w:pPr>
-      <w:r>
-        <w:t>Основы работы с электронными таблицами</w:t>
+        <w:t>Отчёт: электронные таблицы</w:t>
       </w:r>
     </w:p>
     <w:p>
       <w:r>
-        <w:t>Тема 2.2 • Использование формул и стандартных функций • Учёт и анализ производственных данных</w:t>
-      </w:r>
-    </w:p>
-    <w:p>
-      <w:r>
-        <w:t>Дата подготовки: 23 октября 2026 года</w:t>
-      </w:r>
-    </w:p>
-    <w:p>
-      <w:r>
-        <w:t>Основание: 48 скриншотов сценария урока из репозитория pqwerty. Выполнены расчётные задания, ответы на вопросы и все пять итоговых вариантов. Организационные действия преподавателя (беседа, показ слайдов, оценивание) не являются отдельными заданиями для файла.</w:t>
-      </w:r>
-    </w:p>
-    <w:p>
-      <w:r>
-        <w:t>Приложение: «Практические_задания.xlsx» — единая книга из 18 листов, включая навигацию. Расчёты выполнены формулами, а не вставлены как неизменяемые ответы. Отчёт фиксирует результаты исходного набора данных; после изменения книги текст Word не обновляется автоматически.</w:t>
-      </w:r>
-    </w:p>
-    <w:p>
-      <w:pPr>
-        <w:pStyle w:val="Heading1"/>
-      </w:pPr>
-      <w:r>
-        <w:t>Содержание</w:t>
-      </w:r>
-    </w:p>
-    <w:p>
-      <w:r>
-        <w:t>1. Цель, исходные данные и принятые допущения</w:t>
-      </w:r>
-    </w:p>
-    <w:p>
-      <w:r>
-        <w:t>2. Ответы на вопросы об электронных таблицах</w:t>
-      </w:r>
-    </w:p>
-    <w:p>
-      <w:r>
-        <w:t>3. Отчёт ООО «ТекстильПром»</w:t>
-      </w:r>
-    </w:p>
-    <w:p>
-      <w:r>
-        <w:t>4. Задачи 1–7 по стандартным функциям</w:t>
-      </w:r>
-    </w:p>
-    <w:p>
-      <w:r>
-        <w:t>5. Самостоятельные задачи 1–4</w:t>
-      </w:r>
-    </w:p>
-    <w:p>
-      <w:r>
-        <w:t>6. Итоговые варианты 1–5</w:t>
-      </w:r>
-    </w:p>
-    <w:p>
-      <w:r>
-        <w:t>7. Проверка требований, ошибки и выводы</w:t>
-      </w:r>
-    </w:p>
-    <w:p>
-      <w:r>
-        <w:t>Приложение. Соответствие скриншотов результатам</w:t>
-      </w:r>
-    </w:p>
-    <w:p>
-      <w:r>
-        <w:br w:type="page"/>
-      </w:r>
-    </w:p>
-    <w:p>
-      <w:pPr>
-        <w:pStyle w:val="Heading1"/>
-      </w:pPr>
-      <w:r>
-        <w:t>1. Цель, исходные данные и допущения</w:t>
-      </w:r>
-    </w:p>
-    <w:p>
-      <w:r>
-        <w:t>Цель: создать структурированные таблицы, освоить ввод чисел, текста и дат, применить относительные и абсолютные ссылки, формулы и функции, построить диаграммы и сформулировать выводы по результатам.</w:t>
-      </w:r>
-    </w:p>
-    <w:p>
-      <w:r>
-        <w:t>• Исходные значения отчёта «ТекстильПром», продаж по месяцам и стоимости партии ткани перенесены со скриншотов без изменения. Даты 01.10.2024 и 10.06.2025 сохранены по условию.</w:t>
-      </w:r>
-    </w:p>
-    <w:p>
-      <w:r>
-        <w:t>• В задачах без числовых входных данных использованы явно обозначенные учебные примеры. Это разрешено в сценарии (скриншот 132735). Все данные пяти итоговых вариантов являются учебными; варианты 3 и 5 опираются на исходный отчёт.</w:t>
-      </w:r>
-    </w:p>
-    <w:p>
-      <w:r>
-        <w:t>• В задачах 5 и 6 в обоих случаях указан срок в рабочих днях. Поэтому обе используют РАБДЕНЬ и исключают выходные. Утверждение сценария о различии задач в исключении выходных неточно.</w:t>
-      </w:r>
-    </w:p>
-    <w:p>
-      <w:r>
-        <w:t>• Для самостоятельной задачи 3 принята пятидневка РФ с исключением 12 и 13 июня 2025 года. 13 июня учитывается как перенесённый выходной. Календарь организации может отличаться: список дат доступен для редактирования.</w:t>
-      </w:r>
-    </w:p>
-    <w:p>
-      <w:r>
-        <w:t>• В решении проверки качества на скриншоте адреса B2/C2/D2 не совпадают с заголовками A/B/C. Они исправлены. Прочность ≥ 50 обязательна для всех сегментов; массмаркет освобождается только от ограничения по цвету, как следует из формулы и примера решения.</w:t>
-      </w:r>
-    </w:p>
-    <w:p>
-      <w:r>
-        <w:t>• В формуле РАБДЕНЬ.МЕЖД на скриншоте пропущен третий аргумент — тип выходных. Исправлено: РАБДЕНЬ.МЕЖД(A2;C2;1;$B$2:$B$3).</w:t>
-      </w:r>
-    </w:p>
-    <w:p>
-      <w:r>
-        <w:t>• Показатель «рентабельности» в задаче о пяти партиях рассчитывается по формуле сценария, но подписан как стоимостное отклонение от плана. Настоящая рентабельность в варианте 5 — прибыль, делённая на затраты.</w:t>
-      </w:r>
-    </w:p>
-    <w:p>
-      <w:r>
-        <w:t>• СРЗНАЧ относится к статистическим функциям Excel, хотя на одном слайде отнесена к математическим. В книге использована корректная функция AVERAGE.</w:t>
-      </w:r>
-    </w:p>
-    <w:p>
-      <w:r>
-        <w:t>• Внутри XLSX имена функций хранятся на английском, как требует формат Excel. Русская версия Excel отображает их локализованные названия. В отчёте приведены русские имена и разделитель «;».</w:t>
-      </w:r>
-    </w:p>
-    <w:p>
-      <w:pPr>
-        <w:pStyle w:val="Heading1"/>
-      </w:pPr>
-      <w:r>
-        <w:t>2. Ответы на вопросы об электронных таблицах</w:t>
+        <w:t>Выполнены задания по 48 скриншотам. Приложение: «Практические_задания.xlsx» — 18 листов, 206 формул, 13 диаграмм. Все пять итоговых вариантов включены в одну книгу.</w:t>
       </w:r>
     </w:p>
     <w:p>
@@ -162,12 +20,240 @@
         <w:pStyle w:val="Heading2"/>
       </w:pPr>
       <w:r>
-        <w:t>Что такое информация? Какие формы представления существуют?</w:t>
+        <w:t>1. Отчёт «ТекстильПром»</w:t>
+      </w:r>
+    </w:p>
+    <w:tbl>
+      <w:tblPr>
+        <w:tblStyle w:val="TableGrid"/>
+        <w:tblW w:type="auto" w:w="0"/>
+        <w:tblLook w:firstColumn="1" w:firstRow="1" w:lastColumn="0" w:lastRow="0" w:noHBand="0" w:noVBand="1" w:val="04A0"/>
+      </w:tblPr>
+      <w:tblGrid>
+        <w:gridCol w:w="2493"/>
+        <w:gridCol w:w="2493"/>
+        <w:gridCol w:w="2493"/>
+        <w:gridCol w:w="2493"/>
+      </w:tblGrid>
+      <w:tr>
+        <w:tc>
+          <w:tcPr>
+            <w:tcW w:type="dxa" w:w="2493"/>
+          </w:tcPr>
+          <w:p>
+            <w:r>
+              <w:t>Продукция</w:t>
+            </w:r>
+          </w:p>
+        </w:tc>
+        <w:tc>
+          <w:tcPr>
+            <w:tcW w:type="dxa" w:w="2493"/>
+          </w:tcPr>
+          <w:p>
+            <w:r>
+              <w:t>План / факт, шт.</w:t>
+            </w:r>
+          </w:p>
+        </w:tc>
+        <w:tc>
+          <w:tcPr>
+            <w:tcW w:type="dxa" w:w="2493"/>
+          </w:tcPr>
+          <w:p>
+            <w:r>
+              <w:t>Выполнение</w:t>
+            </w:r>
+          </w:p>
+        </w:tc>
+        <w:tc>
+          <w:tcPr>
+            <w:tcW w:type="dxa" w:w="2493"/>
+          </w:tcPr>
+          <w:p>
+            <w:r>
+              <w:t>Прибыль, ₽</w:t>
+            </w:r>
+          </w:p>
+        </w:tc>
+      </w:tr>
+      <w:tr>
+        <w:tc>
+          <w:tcPr>
+            <w:tcW w:type="dxa" w:w="2493"/>
+          </w:tcPr>
+          <w:p>
+            <w:r>
+              <w:t>Платья</w:t>
+            </w:r>
+          </w:p>
+        </w:tc>
+        <w:tc>
+          <w:tcPr>
+            <w:tcW w:type="dxa" w:w="2493"/>
+          </w:tcPr>
+          <w:p>
+            <w:r>
+              <w:t>500 / 470</w:t>
+            </w:r>
+          </w:p>
+        </w:tc>
+        <w:tc>
+          <w:tcPr>
+            <w:tcW w:type="dxa" w:w="2493"/>
+          </w:tcPr>
+          <w:p>
+            <w:r>
+              <w:t>94%</w:t>
+            </w:r>
+          </w:p>
+        </w:tc>
+        <w:tc>
+          <w:tcPr>
+            <w:tcW w:type="dxa" w:w="2493"/>
+          </w:tcPr>
+          <w:p>
+            <w:r>
+              <w:t>470 000</w:t>
+            </w:r>
+          </w:p>
+        </w:tc>
+      </w:tr>
+      <w:tr>
+        <w:tc>
+          <w:tcPr>
+            <w:tcW w:type="dxa" w:w="2493"/>
+          </w:tcPr>
+          <w:p>
+            <w:r>
+              <w:t>Футболки</w:t>
+            </w:r>
+          </w:p>
+        </w:tc>
+        <w:tc>
+          <w:tcPr>
+            <w:tcW w:type="dxa" w:w="2493"/>
+          </w:tcPr>
+          <w:p>
+            <w:r>
+              <w:t>300 / 300</w:t>
+            </w:r>
+          </w:p>
+        </w:tc>
+        <w:tc>
+          <w:tcPr>
+            <w:tcW w:type="dxa" w:w="2493"/>
+          </w:tcPr>
+          <w:p>
+            <w:r>
+              <w:t>100%</w:t>
+            </w:r>
+          </w:p>
+        </w:tc>
+        <w:tc>
+          <w:tcPr>
+            <w:tcW w:type="dxa" w:w="2493"/>
+          </w:tcPr>
+          <w:p>
+            <w:r>
+              <w:t>75 000</w:t>
+            </w:r>
+          </w:p>
+        </w:tc>
+      </w:tr>
+      <w:tr>
+        <w:tc>
+          <w:tcPr>
+            <w:tcW w:type="dxa" w:w="2493"/>
+          </w:tcPr>
+          <w:p>
+            <w:r>
+              <w:t>Джинсы</w:t>
+            </w:r>
+          </w:p>
+        </w:tc>
+        <w:tc>
+          <w:tcPr>
+            <w:tcW w:type="dxa" w:w="2493"/>
+          </w:tcPr>
+          <w:p>
+            <w:r>
+              <w:t>400 / 460</w:t>
+            </w:r>
+          </w:p>
+        </w:tc>
+        <w:tc>
+          <w:tcPr>
+            <w:tcW w:type="dxa" w:w="2493"/>
+          </w:tcPr>
+          <w:p>
+            <w:r>
+              <w:t>115%</w:t>
+            </w:r>
+          </w:p>
+        </w:tc>
+        <w:tc>
+          <w:tcPr>
+            <w:tcW w:type="dxa" w:w="2493"/>
+          </w:tcPr>
+          <w:p>
+            <w:r>
+              <w:t>414 000</w:t>
+            </w:r>
+          </w:p>
+        </w:tc>
+      </w:tr>
+      <w:tr>
+        <w:tc>
+          <w:tcPr>
+            <w:tcW w:type="dxa" w:w="2493"/>
+          </w:tcPr>
+          <w:p>
+            <w:r>
+              <w:t>Юбки</w:t>
+            </w:r>
+          </w:p>
+        </w:tc>
+        <w:tc>
+          <w:tcPr>
+            <w:tcW w:type="dxa" w:w="2493"/>
+          </w:tcPr>
+          <w:p>
+            <w:r>
+              <w:t>470 / 450</w:t>
+            </w:r>
+          </w:p>
+        </w:tc>
+        <w:tc>
+          <w:tcPr>
+            <w:tcW w:type="dxa" w:w="2493"/>
+          </w:tcPr>
+          <w:p>
+            <w:r>
+              <w:t>95,74%</w:t>
+            </w:r>
+          </w:p>
+        </w:tc>
+        <w:tc>
+          <w:tcPr>
+            <w:tcW w:type="dxa" w:w="2493"/>
+          </w:tcPr>
+          <w:p>
+            <w:r>
+              <w:t>135 000</w:t>
+            </w:r>
+          </w:p>
+        </w:tc>
+      </w:tr>
+    </w:tbl>
+    <w:p>
+      <w:r>
+        <w:t>Итого: план 1 670 шт., факт 1 680 шт., выполнение 100,60%, прибыль 1 094 000 ₽. Наибольшую прибыль дают платья. План не выполнен по платьям и юбкам.</w:t>
       </w:r>
     </w:p>
     <w:p>
       <w:r>
-        <w:t>Информация — сведения об объектах, явлениях и процессах. Формы представления: текстовая, числовая, графическая, звуковая и видео. Табличная форма организует данные в строки и столбцы.</w:t>
+        <w:t>Формулы: выполнение = факт / план × 100; прибыль на единицу = цена − себестоимость; общая прибыль = прибыль на единицу × факт. Круговая диаграмма построена по общей прибыли.</w:t>
       </w:r>
     </w:p>
     <w:p>
@@ -175,1770 +261,272 @@
         <w:pStyle w:val="Heading2"/>
       </w:pPr>
       <w:r>
-        <w:t>В какой форме представлен исходный отчёт и какую лучше выбрать?</w:t>
-      </w:r>
-    </w:p>
-    <w:p>
-      <w:r>
-        <w:t>Отчёт представлен текстом с числовыми данными. Для сравнения четырёх видов продукции лучше таблица: каждая строка — изделие, каждый столбец — показатель. Это ускоряет поиск, сравнение, вычисления и обнаружение отклонений.</w:t>
-      </w:r>
-    </w:p>
-    <w:p>
-      <w:pPr>
-        <w:pStyle w:val="Heading2"/>
-      </w:pPr>
-      <w:r>
-        <w:t>О каких объектах идёт речь? Что разместить в строках и столбцах?</w:t>
-      </w:r>
-    </w:p>
-    <w:p>
-      <w:r>
-        <w:t>Объекты: платья, футболки, джинсы, юбки. Столбцы: номер, название, единица измерения, план, факт, процент выполнения, себестоимость, цена продажи, прибыль на единицу и общая прибыль.</w:t>
-      </w:r>
-    </w:p>
-    <w:p>
-      <w:pPr>
-        <w:pStyle w:val="Heading2"/>
-      </w:pPr>
-      <w:r>
-        <w:t>Какие расчёты нужны и одинаковы ли формулы?</w:t>
-      </w:r>
-    </w:p>
-    <w:p>
-      <w:r>
-        <w:t>Нужны факт/план × 100, цена − себестоимость, прибыль на единицу × фактический выпуск, сумма прибыли. Структура формул одинакова; при копировании меняется номер строки. Ручной расчёт возможен, но для большого числа записей эффективнее электронная таблица.</w:t>
-      </w:r>
-    </w:p>
-    <w:p>
-      <w:pPr>
-        <w:pStyle w:val="Heading2"/>
-      </w:pPr>
-      <w:r>
-        <w:t>Для чего используют электронные таблицы? Примеры из жизни и профессии.</w:t>
-      </w:r>
-    </w:p>
-    <w:p>
-      <w:r>
-        <w:t>Для расчётов, хранения данных, сортировки, фильтрации, анализа и визуализации. Примеры: семейный бюджет, сравнение цен, успеваемость, спортивная статистика; в производстве — сметы, сырьё, зарплата, план-факт, сроки заказа, логистика. Автоматизация уменьшает повторный ввод; совместная работа помогает согласовывать планы.</w:t>
-      </w:r>
-    </w:p>
-    <w:p>
-      <w:pPr>
-        <w:pStyle w:val="Heading2"/>
-      </w:pPr>
-      <w:r>
-        <w:t>Как преобразовать текст в таблицу?</w:t>
-      </w:r>
-    </w:p>
-    <w:p>
-      <w:r>
-        <w:t>Выделить объекты и их свойства, выбрать заголовки и единицы измерения, создать по строке на каждый объект, перенести исходные данные и добавить расчётные столбцы. Не смешивать разные типы данных и единицы в одном столбце.</w:t>
-      </w:r>
-    </w:p>
-    <w:p>
-      <w:pPr>
-        <w:pStyle w:val="Heading2"/>
-      </w:pPr>
-      <w:r>
-        <w:t>Что значит создать электронную таблицу?</w:t>
-      </w:r>
-    </w:p>
-    <w:p>
-      <w:r>
-        <w:t>Создать книгу с листами, определить структуру, ввести и оформить данные, добавить формулы, проверить результаты и сохранить файл. В отличие от обычной таблицы в тексте, электронная таблица автоматически пересчитывает зависимые ячейки.</w:t>
-      </w:r>
-    </w:p>
-    <w:p>
-      <w:pPr>
-        <w:pStyle w:val="Heading2"/>
-      </w:pPr>
-      <w:r>
-        <w:t>Какова структура таблицы и какие типы данных допустимы?</w:t>
-      </w:r>
-    </w:p>
-    <w:p>
-      <w:r>
-        <w:t>Книга → листы → строки и столбцы → ячейки и диапазоны. Столбцы имеют буквенные обозначения, строки — номера; пример адреса B2, диапазона C4:E4. Вводят текст, числа, логические значения, даты и время, формулы. Даты и время хранятся как числа с соответствующим форматом.</w:t>
-      </w:r>
-    </w:p>
-    <w:p>
-      <w:pPr>
-        <w:pStyle w:val="Heading2"/>
-      </w:pPr>
-      <w:r>
-        <w:t>Какие возможности даёт табличная организация?</w:t>
-      </w:r>
-    </w:p>
-    <w:p>
-      <w:r>
-        <w:t>Упорядоченность, быстрый поиск и сравнение, подсчёт сумм и средних, сортировка, фильтрация, выделение исключений и построение диаграмм. Числовая и текстовая информация в работе объединены табличной формой.</w:t>
-      </w:r>
-    </w:p>
-    <w:p>
-      <w:pPr>
-        <w:pStyle w:val="Heading2"/>
-      </w:pPr>
-      <w:r>
-        <w:t>Как вводить и копировать формулы?</w:t>
-      </w:r>
-    </w:p>
-    <w:p>
-      <w:r>
-        <w:t>Формула начинается с =. Операторы: +, −, *, /, ^. Например =H3-G3. Копирование: маркер заполнения, Ctrl+C/Ctrl+V, двойной щелчок по маркеру при смежном заполненном столбце. Относительная ссылка E3 меняется при копировании, абсолютная $L$2 остаётся прежней.</w:t>
-      </w:r>
-    </w:p>
-    <w:p>
-      <w:pPr>
-        <w:pStyle w:val="Heading2"/>
-      </w:pPr>
-      <w:r>
-        <w:t>Как округлять отображение без изменения результата?</w:t>
-      </w:r>
-    </w:p>
-    <w:p>
-      <w:r>
-        <w:t>Через формат ячеек задают число десятичных знаков. Это меняет только отображение. Функция ОКРУГЛ изменяет вычисленное значение. В отчёте цеха процент юбок показан как 96 при сохранённом точном значении 95,74468… .</w:t>
-      </w:r>
-    </w:p>
-    <w:p>
-      <w:pPr>
-        <w:pStyle w:val="Heading2"/>
-      </w:pPr>
-      <w:r>
-        <w:t>Как вычислить прибыль и выбрать данные круговой диаграммы?</w:t>
-      </w:r>
-    </w:p>
-    <w:p>
-      <w:r>
-        <w:t>Прибыль на единицу = цена − себестоимость. Общая прибыль = прибыль на единицу × факт. Для круговой диаграммы берут названия изделий и общую прибыль (B3:B6 и J3:J6), а не прибыль на единицу. Доход/выручка и прибыль не равнозначны.</w:t>
-      </w:r>
-    </w:p>
-    <w:p>
-      <w:pPr>
-        <w:pStyle w:val="Heading2"/>
-      </w:pPr>
-      <w:r>
-        <w:t>Какие категории функций существуют?</w:t>
-      </w:r>
-    </w:p>
-    <w:p>
-      <w:r>
-        <w:t>Математические (СУММ, ОКРУГЛ, КОРЕНЬ), статистические (СРЗНАЧ, МАКС, МИН, СЧЁТ, СЧЁТЕСЛИ), логические (ЕСЛИ, И, ИЛИ), даты и времени (РАБДЕНЬ, СЕГОДНЯ, ДЕНЬ, МЕСЯЦ), текстовые (ЛЕВСИМВ, ПРОПИСН, СЦЕПИТЬ), ссылки и массивы (ВПР, ИНДЕКС, ПОИСКПОЗ), работа с базой данных.</w:t>
-      </w:r>
-    </w:p>
-    <w:p>
-      <w:pPr>
-        <w:pStyle w:val="Heading1"/>
-      </w:pPr>
-      <w:r>
-        <w:t>3. Отчёт ООО «ТекстильПром»</w:t>
-      </w:r>
-    </w:p>
-    <w:p>
-      <w:r>
-        <w:t>Лист 01_ТекстильПром. Заголовки расположены в строке 2, изделия — в строках 3–6, как на скриншотах. Столбцы F, I и J содержат формулы с относительными ссылками; добавлена строка итогов.</w:t>
+        <w:t>2. Задачи по функциям</w:t>
       </w:r>
     </w:p>
     <w:tbl>
       <w:tblPr>
-        <w:tblStyle w:val="LightShading-Accent1"/>
+        <w:tblStyle w:val="TableGrid"/>
         <w:tblW w:type="auto" w:w="0"/>
         <w:tblLook w:firstColumn="1" w:firstRow="1" w:lastColumn="0" w:lastRow="0" w:noHBand="0" w:noVBand="1" w:val="04A0"/>
       </w:tblPr>
       <w:tblGrid>
-        <w:gridCol w:w="1972"/>
-        <w:gridCol w:w="1972"/>
-        <w:gridCol w:w="1972"/>
-        <w:gridCol w:w="1972"/>
-        <w:gridCol w:w="1972"/>
+        <w:gridCol w:w="3324"/>
+        <w:gridCol w:w="3324"/>
+        <w:gridCol w:w="3324"/>
       </w:tblGrid>
       <w:tr>
-        <w:trPr>
-          <w:cantSplit/>
-        </w:trPr>
         <w:tc>
           <w:tcPr>
-            <w:tcW w:type="dxa" w:w="1972"/>
+            <w:tcW w:type="dxa" w:w="3324"/>
           </w:tcPr>
           <w:p>
             <w:r>
-              <w:rPr>
-                <w:sz w:val="18"/>
-              </w:rPr>
-              <w:t>Изделие</w:t>
+              <w:t>№</w:t>
             </w:r>
           </w:p>
         </w:tc>
         <w:tc>
           <w:tcPr>
-            <w:tcW w:type="dxa" w:w="1972"/>
+            <w:tcW w:type="dxa" w:w="3324"/>
           </w:tcPr>
           <w:p>
             <w:r>
-              <w:rPr>
-                <w:sz w:val="18"/>
-              </w:rPr>
-              <w:t>План / факт</w:t>
+              <w:t>Расчёт</w:t>
             </w:r>
           </w:p>
         </w:tc>
         <w:tc>
           <w:tcPr>
-            <w:tcW w:type="dxa" w:w="1972"/>
+            <w:tcW w:type="dxa" w:w="3324"/>
           </w:tcPr>
           <w:p>
             <w:r>
-              <w:rPr>
-                <w:sz w:val="18"/>
-              </w:rPr>
-              <w:t>Выполнение</w:t>
+              <w:t>Результат</w:t>
+            </w:r>
+          </w:p>
+        </w:tc>
+      </w:tr>
+      <w:tr>
+        <w:tc>
+          <w:tcPr>
+            <w:tcW w:type="dxa" w:w="3324"/>
+          </w:tcPr>
+          <w:p>
+            <w:r>
+              <w:t>1</w:t>
             </w:r>
           </w:p>
         </w:tc>
         <w:tc>
           <w:tcPr>
-            <w:tcW w:type="dxa" w:w="1972"/>
+            <w:tcW w:type="dxa" w:w="3324"/>
           </w:tcPr>
           <w:p>
             <w:r>
-              <w:rPr>
-                <w:sz w:val="18"/>
-              </w:rPr>
-              <w:t>Прибыль/ед., ₽</w:t>
+              <w:t>СУММ и СРЗНАЧ для 10, 20, …, 100</w:t>
             </w:r>
           </w:p>
         </w:tc>
         <w:tc>
           <w:tcPr>
-            <w:tcW w:type="dxa" w:w="1972"/>
+            <w:tcW w:type="dxa" w:w="3324"/>
           </w:tcPr>
           <w:p>
             <w:r>
-              <w:rPr>
-                <w:sz w:val="18"/>
-              </w:rPr>
-              <w:t>Всего, ₽</w:t>
+              <w:t>550; 55</w:t>
             </w:r>
           </w:p>
         </w:tc>
       </w:tr>
       <w:tr>
-        <w:trPr>
-          <w:cantSplit/>
-        </w:trPr>
         <w:tc>
           <w:tcPr>
-            <w:tcW w:type="dxa" w:w="1972"/>
+            <w:tcW w:type="dxa" w:w="3324"/>
           </w:tcPr>
           <w:p>
             <w:r>
-              <w:rPr>
-                <w:sz w:val="18"/>
-              </w:rPr>
-              <w:t>Платья</w:t>
+              <w:t>2</w:t>
             </w:r>
           </w:p>
         </w:tc>
         <w:tc>
           <w:tcPr>
-            <w:tcW w:type="dxa" w:w="1972"/>
+            <w:tcW w:type="dxa" w:w="3324"/>
           </w:tcPr>
           <w:p>
             <w:r>
-              <w:rPr>
-                <w:sz w:val="18"/>
-              </w:rPr>
-              <w:t>500 / 470</w:t>
+              <w:t>СРЗНАЧЕСЛИ, исключая нули</w:t>
             </w:r>
           </w:p>
         </w:tc>
         <w:tc>
           <w:tcPr>
-            <w:tcW w:type="dxa" w:w="1972"/>
+            <w:tcW w:type="dxa" w:w="3324"/>
           </w:tcPr>
           <w:p>
             <w:r>
-              <w:rPr>
-                <w:sz w:val="18"/>
-              </w:rPr>
-              <w:t>94.00%</w:t>
+              <w:t>40</w:t>
+            </w:r>
+          </w:p>
+        </w:tc>
+      </w:tr>
+      <w:tr>
+        <w:tc>
+          <w:tcPr>
+            <w:tcW w:type="dxa" w:w="3324"/>
+          </w:tcPr>
+          <w:p>
+            <w:r>
+              <w:t>3</w:t>
             </w:r>
           </w:p>
         </w:tc>
         <w:tc>
           <w:tcPr>
-            <w:tcW w:type="dxa" w:w="1972"/>
+            <w:tcW w:type="dxa" w:w="3324"/>
           </w:tcPr>
           <w:p>
             <w:r>
-              <w:rPr>
-                <w:sz w:val="18"/>
-              </w:rPr>
-              <w:t>1000</w:t>
+              <w:t>ЕСЛИ: покупка 6 000 ₽, скидка 10%</w:t>
             </w:r>
           </w:p>
         </w:tc>
         <w:tc>
           <w:tcPr>
-            <w:tcW w:type="dxa" w:w="1972"/>
+            <w:tcW w:type="dxa" w:w="3324"/>
           </w:tcPr>
           <w:p>
             <w:r>
-              <w:rPr>
-                <w:sz w:val="18"/>
-              </w:rPr>
-              <w:t>470,000</w:t>
+              <w:t>К оплате 5 400 ₽</w:t>
             </w:r>
           </w:p>
         </w:tc>
       </w:tr>
       <w:tr>
-        <w:trPr>
-          <w:cantSplit/>
-        </w:trPr>
         <w:tc>
           <w:tcPr>
-            <w:tcW w:type="dxa" w:w="1972"/>
+            <w:tcW w:type="dxa" w:w="3324"/>
           </w:tcPr>
           <w:p>
             <w:r>
-              <w:rPr>
-                <w:sz w:val="18"/>
-              </w:rPr>
-              <w:t>Футболки</w:t>
+              <w:t>4</w:t>
             </w:r>
           </w:p>
         </w:tc>
         <w:tc>
           <w:tcPr>
-            <w:tcW w:type="dxa" w:w="1972"/>
+            <w:tcW w:type="dxa" w:w="3324"/>
           </w:tcPr>
           <w:p>
             <w:r>
-              <w:rPr>
-                <w:sz w:val="18"/>
-              </w:rPr>
-              <w:t>300 / 300</w:t>
+              <w:t>ЕСЛИ + И: возраст 18, подписка «Да»</w:t>
             </w:r>
           </w:p>
         </w:tc>
         <w:tc>
           <w:tcPr>
-            <w:tcW w:type="dxa" w:w="1972"/>
+            <w:tcW w:type="dxa" w:w="3324"/>
           </w:tcPr>
           <w:p>
             <w:r>
-              <w:rPr>
-                <w:sz w:val="18"/>
-              </w:rPr>
-              <w:t>100.00%</w:t>
+              <w:t>Доступ разрешён</w:t>
+            </w:r>
+          </w:p>
+        </w:tc>
+      </w:tr>
+      <w:tr>
+        <w:tc>
+          <w:tcPr>
+            <w:tcW w:type="dxa" w:w="3324"/>
+          </w:tcPr>
+          <w:p>
+            <w:r>
+              <w:t>5</w:t>
             </w:r>
           </w:p>
         </w:tc>
         <w:tc>
           <w:tcPr>
-            <w:tcW w:type="dxa" w:w="1972"/>
+            <w:tcW w:type="dxa" w:w="3324"/>
           </w:tcPr>
           <w:p>
             <w:r>
-              <w:rPr>
-                <w:sz w:val="18"/>
-              </w:rPr>
-              <w:t>250</w:t>
+              <w:t>РАБДЕНЬ: 01.10.2024 + 10 рабочих дней</w:t>
             </w:r>
           </w:p>
         </w:tc>
         <w:tc>
           <w:tcPr>
-            <w:tcW w:type="dxa" w:w="1972"/>
+            <w:tcW w:type="dxa" w:w="3324"/>
           </w:tcPr>
           <w:p>
             <w:r>
-              <w:rPr>
-                <w:sz w:val="18"/>
-              </w:rPr>
-              <w:t>75,000</w:t>
+              <w:t>15.10.2024, вторник</w:t>
             </w:r>
           </w:p>
         </w:tc>
       </w:tr>
       <w:tr>
-        <w:trPr>
-          <w:cantSplit/>
-        </w:trPr>
         <w:tc>
           <w:tcPr>
-            <w:tcW w:type="dxa" w:w="1972"/>
+            <w:tcW w:type="dxa" w:w="3324"/>
           </w:tcPr>
           <w:p>
             <w:r>
-              <w:rPr>
-                <w:sz w:val="18"/>
-              </w:rPr>
-              <w:t>Джинсы</w:t>
+              <w:t>6</w:t>
             </w:r>
           </w:p>
         </w:tc>
         <w:tc>
           <w:tcPr>
-            <w:tcW w:type="dxa" w:w="1972"/>
+            <w:tcW w:type="dxa" w:w="3324"/>
           </w:tcPr>
           <w:p>
             <w:r>
-              <w:rPr>
-                <w:sz w:val="18"/>
-              </w:rPr>
-              <w:t>400 / 460</w:t>
+              <w:t>РАБДЕНЬ и ДЕНЬНЕД: проверка пятницы</w:t>
             </w:r>
           </w:p>
         </w:tc>
         <w:tc>
           <w:tcPr>
-            <w:tcW w:type="dxa" w:w="1972"/>
+            <w:tcW w:type="dxa" w:w="3324"/>
           </w:tcPr>
           <w:p>
             <w:r>
-              <w:rPr>
-                <w:sz w:val="18"/>
-              </w:rPr>
-              <w:t>115.00%</w:t>
+              <w:t>15.10.2024 — не пятница</w:t>
+            </w:r>
+          </w:p>
+        </w:tc>
+      </w:tr>
+      <w:tr>
+        <w:tc>
+          <w:tcPr>
+            <w:tcW w:type="dxa" w:w="3324"/>
+          </w:tcPr>
+          <w:p>
+            <w:r>
+              <w:t>7</w:t>
             </w:r>
           </w:p>
         </w:tc>
         <w:tc>
           <w:tcPr>
-            <w:tcW w:type="dxa" w:w="1972"/>
+            <w:tcW w:type="dxa" w:w="3324"/>
           </w:tcPr>
           <w:p>
             <w:r>
-              <w:rPr>
-                <w:sz w:val="18"/>
-              </w:rPr>
-              <w:t>900</w:t>
+              <w:t>СРЗНАЧ, ИНДЕКС, ПОИСКПОЗ, СЧЁТЕСЛИ</w:t>
             </w:r>
           </w:p>
         </w:tc>
         <w:tc>
           <w:tcPr>
-            <w:tcW w:type="dxa" w:w="1972"/>
+            <w:tcW w:type="dxa" w:w="3324"/>
           </w:tcPr>
           <w:p>
             <w:r>
-              <w:rPr>
-                <w:sz w:val="18"/>
-              </w:rPr>
-              <w:t>414,000</w:t>
-            </w:r>
-          </w:p>
-        </w:tc>
-      </w:tr>
-      <w:tr>
-        <w:trPr>
-          <w:cantSplit/>
-        </w:trPr>
-        <w:tc>
-          <w:tcPr>
-            <w:tcW w:type="dxa" w:w="1972"/>
-          </w:tcPr>
-          <w:p>
-            <w:r>
-              <w:rPr>
-                <w:sz w:val="18"/>
-              </w:rPr>
-              <w:t>Юбки</w:t>
-            </w:r>
-          </w:p>
-        </w:tc>
-        <w:tc>
-          <w:tcPr>
-            <w:tcW w:type="dxa" w:w="1972"/>
-          </w:tcPr>
-          <w:p>
-            <w:r>
-              <w:rPr>
-                <w:sz w:val="18"/>
-              </w:rPr>
-              <w:t>470 / 450</w:t>
-            </w:r>
-          </w:p>
-        </w:tc>
-        <w:tc>
-          <w:tcPr>
-            <w:tcW w:type="dxa" w:w="1972"/>
-          </w:tcPr>
-          <w:p>
-            <w:r>
-              <w:rPr>
-                <w:sz w:val="18"/>
-              </w:rPr>
-              <w:t>95.74%</w:t>
-            </w:r>
-          </w:p>
-        </w:tc>
-        <w:tc>
-          <w:tcPr>
-            <w:tcW w:type="dxa" w:w="1972"/>
-          </w:tcPr>
-          <w:p>
-            <w:r>
-              <w:rPr>
-                <w:sz w:val="18"/>
-              </w:rPr>
-              <w:t>300</w:t>
-            </w:r>
-          </w:p>
-        </w:tc>
-        <w:tc>
-          <w:tcPr>
-            <w:tcW w:type="dxa" w:w="1972"/>
-          </w:tcPr>
-          <w:p>
-            <w:r>
-              <w:rPr>
-                <w:sz w:val="18"/>
-              </w:rPr>
-              <w:t>135,000</w:t>
-            </w:r>
-          </w:p>
-        </w:tc>
-      </w:tr>
-    </w:tbl>
-    <w:p>
-      <w:r>
-        <w:t>F3 = E3*100/D3; I3 = H3-G3; J3 = I3*E3; J7 = СУММ(J3:J6)</w:t>
-      </w:r>
-    </w:p>
-    <w:p>
-      <w:r>
-        <w:t>План: 1 670 шт.; факт: 1 680 шт.; выполнение 100,60%. Максимальная прибыль — платья (470 000 ₽). Джинсы: 115% плана; футболки: 100%; платья: 94%; юбки: 95,74%.</w:t>
-      </w:r>
-    </w:p>
-    <w:p>
-      <w:r>
-        <w:t>Общая прибыль — 1 094 000 ₽. Наибольшая доля у платьев (42,96%), далее джинсы (37,84%), юбки (12,34%) и футболки (6,86%). Совокупное перевыполнение по количеству не означает выполнения плана по каждой позиции.</w:t>
-      </w:r>
-    </w:p>
-    <w:p>
-      <w:r>
-        <w:drawing>
-          <wp:inline xmlns:a="http://schemas.openxmlformats.org/drawingml/2006/main" xmlns:pic="http://schemas.openxmlformats.org/drawingml/2006/picture">
-            <wp:extent cx="5580000" cy="2859749"/>
-            <wp:docPr id="1" name="Picture 1"/>
-            <wp:cNvGraphicFramePr>
-              <a:graphicFrameLocks noChangeAspect="1"/>
-            </wp:cNvGraphicFramePr>
-            <a:graphic>
-              <a:graphicData uri="http://schemas.openxmlformats.org/drawingml/2006/picture">
-                <pic:pic>
-                  <pic:nvPicPr>
-                    <pic:cNvPr id="0" name="._прибыль.png"/>
-                    <pic:cNvPicPr/>
-                  </pic:nvPicPr>
-                  <pic:blipFill>
-                    <a:blip r:embed="rId10"/>
-                    <a:stretch>
-                      <a:fillRect/>
-                    </a:stretch>
-                  </pic:blipFill>
-                  <pic:spPr>
-                    <a:xfrm>
-                      <a:off x="0" y="0"/>
-                      <a:ext cx="5580000" cy="2859749"/>
-                    </a:xfrm>
-                    <a:prstGeom prst="rect"/>
-                  </pic:spPr>
-                </pic:pic>
-              </a:graphicData>
-            </a:graphic>
-          </wp:inline>
-        </w:drawing>
-      </w:r>
-    </w:p>
-    <w:p>
-      <w:pPr>
-        <w:pStyle w:val="Heading1"/>
-      </w:pPr>
-      <w:r>
-        <w:t>4. Задачи 1–7 по стандартным функциям</w:t>
-      </w:r>
-    </w:p>
-    <w:p>
-      <w:pPr>
-        <w:pStyle w:val="Heading2"/>
-      </w:pPr>
-      <w:r>
-        <w:t>Задача 1</w:t>
-      </w:r>
-    </w:p>
-    <w:p>
-      <w:r>
-        <w:t>Лист: 02_Сумма_среднее</w:t>
-      </w:r>
-    </w:p>
-    <w:p>
-      <w:r>
-        <w:t>Формулы: =СУММ(A1:A10); =СРЗНАЧ(A1:A10)</w:t>
-      </w:r>
-    </w:p>
-    <w:p>
-      <w:r>
-        <w:t>Результат: 550; 55</w:t>
-      </w:r>
-    </w:p>
-    <w:p/>
-    <w:p>
-      <w:pPr>
-        <w:pStyle w:val="Heading2"/>
-      </w:pPr>
-      <w:r>
-        <w:t>Задача 2</w:t>
-      </w:r>
-    </w:p>
-    <w:p>
-      <w:r>
-        <w:t>Лист: 03_Среднее_без_нулей</w:t>
-      </w:r>
-    </w:p>
-    <w:p>
-      <w:r>
-        <w:t>Формулы: =СРЗНАЧЕСЛИ(G1:G10;"&lt;&gt;0")</w:t>
-      </w:r>
-    </w:p>
-    <w:p>
-      <w:r>
-        <w:t>Результат: 40</w:t>
-      </w:r>
-    </w:p>
-    <w:p/>
-    <w:p>
-      <w:pPr>
-        <w:pStyle w:val="Heading2"/>
-      </w:pPr>
-      <w:r>
-        <w:t>Задача 3</w:t>
-      </w:r>
-    </w:p>
-    <w:p>
-      <w:r>
-        <w:t>Лист: 04_Скидка</w:t>
-      </w:r>
-    </w:p>
-    <w:p>
-      <w:r>
-        <w:t>Формулы: =ЕСЛИ(B1&gt;5000;B1*0,9;B1*0,95)</w:t>
-      </w:r>
-    </w:p>
-    <w:p>
-      <w:r>
-        <w:t>Результат: 5 400 ₽</w:t>
-      </w:r>
-    </w:p>
-    <w:p>
-      <w:r>
-        <w:t>При сумме ровно 5 000 ₽ скидка 5%, к оплате 4 750 ₽. Входные суммы — учебные.</w:t>
-      </w:r>
-    </w:p>
-    <w:p>
-      <w:pPr>
-        <w:pStyle w:val="Heading2"/>
-      </w:pPr>
-      <w:r>
-        <w:t>Задача 4</w:t>
-      </w:r>
-    </w:p>
-    <w:p>
-      <w:r>
-        <w:t>Лист: 05_Доступ</w:t>
-      </w:r>
-    </w:p>
-    <w:p>
-      <w:r>
-        <w:t>Формулы: =ЕСЛИ(И(C1&gt;=18;C2="Да");"Доступ разрешен";"Отказано")</w:t>
-      </w:r>
-    </w:p>
-    <w:p>
-      <w:r>
-        <w:t>Результат: Доступ разрешен</w:t>
-      </w:r>
-    </w:p>
-    <w:p>
-      <w:r>
-        <w:t>Проверены возрастная граница 18 лет и оба значения подписки.</w:t>
-      </w:r>
-    </w:p>
-    <w:p>
-      <w:pPr>
-        <w:pStyle w:val="Heading2"/>
-      </w:pPr>
-      <w:r>
-        <w:t>Задача 5</w:t>
-      </w:r>
-    </w:p>
-    <w:p>
-      <w:r>
-        <w:t>Лист: 06_Срок_проекта</w:t>
-      </w:r>
-    </w:p>
-    <w:p>
-      <w:r>
-        <w:t>Формулы: =РАБДЕНЬ(A1;B1); день недели — ДЕНЬНЕД(C1;2)</w:t>
-      </w:r>
-    </w:p>
-    <w:p>
-      <w:r>
-        <w:t>Результат: 15.10.2024, вторник</w:t>
-      </w:r>
-    </w:p>
-    <w:p>
-      <w:r>
-        <w:t>Исходный пример: 01.10.2024 + 10 рабочих дней.</w:t>
-      </w:r>
-    </w:p>
-    <w:p>
-      <w:pPr>
-        <w:pStyle w:val="Heading2"/>
-      </w:pPr>
-      <w:r>
-        <w:t>Задача 6</w:t>
-      </w:r>
-    </w:p>
-    <w:p>
-      <w:r>
-        <w:t>Лист: 07_Дедлайн</w:t>
-      </w:r>
-    </w:p>
-    <w:p>
-      <w:r>
-        <w:t>Формулы: =РАБДЕНЬ(A1;B1); день недели — ДЕНЬНЕД(C1;2)</w:t>
-      </w:r>
-    </w:p>
-    <w:p>
-      <w:r>
-        <w:t>Результат: 15.10.2024, вторник</w:t>
-      </w:r>
-    </w:p>
-    <w:p>
-      <w:r>
-        <w:t>Для задачи 6 настроена зелёная подсветка пятницы; тест с 8 рабочими днями даёт 11.10.2024, пятницу.</w:t>
-      </w:r>
-    </w:p>
-    <w:p>
-      <w:pPr>
-        <w:pStyle w:val="Heading2"/>
-      </w:pPr>
-      <w:r>
-        <w:t>Задача 7</w:t>
-      </w:r>
-    </w:p>
-    <w:p>
-      <w:r>
-        <w:t>Лист: 08_Продажи</w:t>
-      </w:r>
-    </w:p>
-    <w:p>
-      <w:r>
-        <w:t>Формулы: =СРЗНАЧ(B2:B13); =ИНДЕКС(A2:A13;ПОИСКПОЗ(МАКС(B2:B13);B2:B13;0)); =СЧЁТЕСЛИ(B2:B13;"&gt;"&amp;СРЗНАЧ(B2:B13))</w:t>
-      </w:r>
-    </w:p>
-    <w:p>
-      <w:r>
-        <w:t>Результат: Среднее: 176,25 тыс. ₽; максимум: декабрь, 300 тыс. ₽; выше среднего: 6 месяцев</w:t>
-      </w:r>
-    </w:p>
-    <w:p>
-      <w:r>
-        <w:t>Выше среднего: апрель, май, июнь, октябрь, ноябрь, декабрь. Всего: 2 115 тыс. ₽.</w:t>
-      </w:r>
-    </w:p>
-    <w:p>
-      <w:r>
-        <w:t>Для определения дня недели использована связка ВЫБОР(ДЕНЬНЕД(C1;2); …) с русскими названиями дней. Для проверки пятницы — ДЕНЬНЕД(C1;2)=5: она не зависит от языка отображения даты. Условное форматирование применено к итоговой дате, как требуется в задании.</w:t>
-      </w:r>
-    </w:p>
-    <w:p>
-      <w:r>
-        <w:drawing>
-          <wp:inline xmlns:a="http://schemas.openxmlformats.org/drawingml/2006/main" xmlns:pic="http://schemas.openxmlformats.org/drawingml/2006/picture">
-            <wp:extent cx="5580000" cy="2650500"/>
-            <wp:docPr id="2" name="Picture 2"/>
-            <wp:cNvGraphicFramePr>
-              <a:graphicFrameLocks noChangeAspect="1"/>
-            </wp:cNvGraphicFramePr>
-            <a:graphic>
-              <a:graphicData uri="http://schemas.openxmlformats.org/drawingml/2006/picture">
-                <pic:pic>
-                  <pic:nvPicPr>
-                    <pic:cNvPr id="0" name="._продажи.png"/>
-                    <pic:cNvPicPr/>
-                  </pic:nvPicPr>
-                  <pic:blipFill>
-                    <a:blip r:embed="rId11"/>
-                    <a:stretch>
-                      <a:fillRect/>
-                    </a:stretch>
-                  </pic:blipFill>
-                  <pic:spPr>
-                    <a:xfrm>
-                      <a:off x="0" y="0"/>
-                      <a:ext cx="5580000" cy="2650500"/>
-                    </a:xfrm>
-                    <a:prstGeom prst="rect"/>
-                  </pic:spPr>
-                </pic:pic>
-              </a:graphicData>
-            </a:graphic>
-          </wp:inline>
-        </w:drawing>
-      </w:r>
-    </w:p>
-    <w:p>
-      <w:pPr>
-        <w:pStyle w:val="Heading1"/>
-      </w:pPr>
-      <w:r>
-        <w:t>5. Самостоятельные задачи 1–4</w:t>
-      </w:r>
-    </w:p>
-    <w:p>
-      <w:pPr>
-        <w:pStyle w:val="Heading2"/>
-      </w:pPr>
-      <w:r>
-        <w:t>Самостоятельная задача 1</w:t>
-      </w:r>
-    </w:p>
-    <w:p>
-      <w:r>
-        <w:t>Лист: 09_Себестоимость</w:t>
-      </w:r>
-    </w:p>
-    <w:p>
-      <w:r>
-        <w:t>Формулы: =ОКРУГЛ(B2*B3*B4*(1+$B$5);2)</w:t>
-      </w:r>
-    </w:p>
-    <w:p>
-      <w:r>
-        <w:t>Результат: 1 260 000 ₽</w:t>
-      </w:r>
-    </w:p>
-    <w:p>
-      <w:r>
-        <w:t>Без НДС: 1 050 000 ₽, НДС: 210 000 ₽. Термин «себестоимость с НДС» принят по учебному условию; возмещаемый НДС обычно не включают в бухгалтерскую себестоимость.</w:t>
-      </w:r>
-    </w:p>
-    <w:p>
-      <w:pPr>
-        <w:pStyle w:val="Heading2"/>
-      </w:pPr>
-      <w:r>
-        <w:t>Самостоятельная задача 2</w:t>
-      </w:r>
-    </w:p>
-    <w:p>
-      <w:r>
-        <w:t>Лист: 10_Качество</w:t>
-      </w:r>
-    </w:p>
-    <w:p>
-      <w:r>
-        <w:t>Формулы: =ЕСЛИ(И(A2&gt;=50;ИЛИ(B2&lt;=5;C2="Массмаркет"));"Годна";"Брак")</w:t>
-      </w:r>
-    </w:p>
-    <w:p>
-      <w:r>
-        <w:t>Результат: Годна; Брак; Годна; Годна; Брак</w:t>
-      </w:r>
-    </w:p>
-    <w:p>
-      <w:r>
-        <w:t>Первые две строки — из скриншота, остальные — граничные тесты.</w:t>
-      </w:r>
-    </w:p>
-    <w:p>
-      <w:pPr>
-        <w:pStyle w:val="Heading2"/>
-      </w:pPr>
-      <w:r>
-        <w:t>Самостоятельная задача 3</w:t>
-      </w:r>
-    </w:p>
-    <w:p>
-      <w:r>
-        <w:t>Лист: 11_Заказ_праздники</w:t>
-      </w:r>
-    </w:p>
-    <w:p>
-      <w:r>
-        <w:t>Формулы: =РАБДЕНЬ.МЕЖД(A2;C2;1;$B$2:$B$3)</w:t>
-      </w:r>
-    </w:p>
-    <w:p>
-      <w:r>
-        <w:t>Результат: 03.07.2025</w:t>
-      </w:r>
-    </w:p>
-    <w:p>
-      <w:r>
-        <w:t>В скриншоте пропущен аргумент выходных: список праздников должен быть четвёртым аргументом РАБДЕНЬ.МЕЖД. При исключении только 12 июня получилось бы 02.07.2025.</w:t>
-      </w:r>
-    </w:p>
-    <w:p>
-      <w:pPr>
-        <w:pStyle w:val="Heading2"/>
-      </w:pPr>
-      <w:r>
-        <w:t>Самостоятельная задача 4</w:t>
-      </w:r>
-    </w:p>
-    <w:p>
-      <w:r>
-        <w:t>Лист: 12_Партии_ткани</w:t>
-      </w:r>
-    </w:p>
-    <w:p>
-      <w:r>
-        <w:t>Формулы: F2=B2/C2; G2=D2/B2; H2=(B2-D2-C2)*E2; =СРЗНАЧ(G2:G6); =СТАНДОТКЛОН(E2:E6)</w:t>
-      </w:r>
-    </w:p>
-    <w:p>
-      <w:r>
-        <w:t>Результат: Средний брак: 2.5759%; максимум: партия 1, 20 000 ₽; стандартное отклонение: 15.8114 ₽/м</w:t>
-      </w:r>
-    </w:p>
-    <w:p>
-      <w:r>
-        <w:t>Использовано выборочное стандартное отклонение, как в решении на скрине. Для всей генеральной совокупности результат был бы 14,1421 ₽/м.</w:t>
-      </w:r>
-    </w:p>
-    <w:p>
-      <w:r>
-        <w:t>Пять учебных партий для самостоятельной задачи 4:</w:t>
-      </w:r>
-    </w:p>
-    <w:tbl>
-      <w:tblPr>
-        <w:tblStyle w:val="LightShading-Accent1"/>
-        <w:tblW w:type="auto" w:w="0"/>
-        <w:tblLook w:firstColumn="1" w:firstRow="1" w:lastColumn="0" w:lastRow="0" w:noHBand="0" w:noVBand="1" w:val="04A0"/>
-      </w:tblPr>
-      <w:tblGrid>
-        <w:gridCol w:w="1972"/>
-        <w:gridCol w:w="1972"/>
-        <w:gridCol w:w="1972"/>
-        <w:gridCol w:w="1972"/>
-        <w:gridCol w:w="1972"/>
-      </w:tblGrid>
-      <w:tr>
-        <w:trPr>
-          <w:cantSplit/>
-        </w:trPr>
-        <w:tc>
-          <w:tcPr>
-            <w:tcW w:type="dxa" w:w="1972"/>
-          </w:tcPr>
-          <w:p>
-            <w:r>
-              <w:rPr>
-                <w:sz w:val="18"/>
-              </w:rPr>
-              <w:t>Партия</w:t>
-            </w:r>
-          </w:p>
-        </w:tc>
-        <w:tc>
-          <w:tcPr>
-            <w:tcW w:type="dxa" w:w="1972"/>
-          </w:tcPr>
-          <w:p>
-            <w:r>
-              <w:rPr>
-                <w:sz w:val="18"/>
-              </w:rPr>
-              <w:t>Факт, м</w:t>
-            </w:r>
-          </w:p>
-        </w:tc>
-        <w:tc>
-          <w:tcPr>
-            <w:tcW w:type="dxa" w:w="1972"/>
-          </w:tcPr>
-          <w:p>
-            <w:r>
-              <w:rPr>
-                <w:sz w:val="18"/>
-              </w:rPr>
-              <w:t>План, м</w:t>
-            </w:r>
-          </w:p>
-        </w:tc>
-        <w:tc>
-          <w:tcPr>
-            <w:tcW w:type="dxa" w:w="1972"/>
-          </w:tcPr>
-          <w:p>
-            <w:r>
-              <w:rPr>
-                <w:sz w:val="18"/>
-              </w:rPr>
-              <w:t>Брак, м</w:t>
-            </w:r>
-          </w:p>
-        </w:tc>
-        <w:tc>
-          <w:tcPr>
-            <w:tcW w:type="dxa" w:w="1972"/>
-          </w:tcPr>
-          <w:p>
-            <w:r>
-              <w:rPr>
-                <w:sz w:val="18"/>
-              </w:rPr>
-              <w:t>Себест., ₽/м</w:t>
-            </w:r>
-          </w:p>
-        </w:tc>
-      </w:tr>
-      <w:tr>
-        <w:trPr>
-          <w:cantSplit/>
-        </w:trPr>
-        <w:tc>
-          <w:tcPr>
-            <w:tcW w:type="dxa" w:w="1972"/>
-          </w:tcPr>
-          <w:p>
-            <w:r>
-              <w:rPr>
-                <w:sz w:val="18"/>
-              </w:rPr>
-              <w:t>Партия 1</w:t>
-            </w:r>
-          </w:p>
-        </w:tc>
-        <w:tc>
-          <w:tcPr>
-            <w:tcW w:type="dxa" w:w="1972"/>
-          </w:tcPr>
-          <w:p>
-            <w:r>
-              <w:rPr>
-                <w:sz w:val="18"/>
-              </w:rPr>
-              <w:t>1100</w:t>
-            </w:r>
-          </w:p>
-        </w:tc>
-        <w:tc>
-          <w:tcPr>
-            <w:tcW w:type="dxa" w:w="1972"/>
-          </w:tcPr>
-          <w:p>
-            <w:r>
-              <w:rPr>
-                <w:sz w:val="18"/>
-              </w:rPr>
-              <w:t>1000</w:t>
-            </w:r>
-          </w:p>
-        </w:tc>
-        <w:tc>
-          <w:tcPr>
-            <w:tcW w:type="dxa" w:w="1972"/>
-          </w:tcPr>
-          <w:p>
-            <w:r>
-              <w:rPr>
-                <w:sz w:val="18"/>
-              </w:rPr>
-              <w:t>20</w:t>
-            </w:r>
-          </w:p>
-        </w:tc>
-        <w:tc>
-          <w:tcPr>
-            <w:tcW w:type="dxa" w:w="1972"/>
-          </w:tcPr>
-          <w:p>
-            <w:r>
-              <w:rPr>
-                <w:sz w:val="18"/>
-              </w:rPr>
-              <w:t>250</w:t>
-            </w:r>
-          </w:p>
-        </w:tc>
-      </w:tr>
-      <w:tr>
-        <w:trPr>
-          <w:cantSplit/>
-        </w:trPr>
-        <w:tc>
-          <w:tcPr>
-            <w:tcW w:type="dxa" w:w="1972"/>
-          </w:tcPr>
-          <w:p>
-            <w:r>
-              <w:rPr>
-                <w:sz w:val="18"/>
-              </w:rPr>
-              <w:t>Партия 2</w:t>
-            </w:r>
-          </w:p>
-        </w:tc>
-        <w:tc>
-          <w:tcPr>
-            <w:tcW w:type="dxa" w:w="1972"/>
-          </w:tcPr>
-          <w:p>
-            <w:r>
-              <w:rPr>
-                <w:sz w:val="18"/>
-              </w:rPr>
-              <w:t>980</w:t>
-            </w:r>
-          </w:p>
-        </w:tc>
-        <w:tc>
-          <w:tcPr>
-            <w:tcW w:type="dxa" w:w="1972"/>
-          </w:tcPr>
-          <w:p>
-            <w:r>
-              <w:rPr>
-                <w:sz w:val="18"/>
-              </w:rPr>
-              <w:t>1000</w:t>
-            </w:r>
-          </w:p>
-        </w:tc>
-        <w:tc>
-          <w:tcPr>
-            <w:tcW w:type="dxa" w:w="1972"/>
-          </w:tcPr>
-          <w:p>
-            <w:r>
-              <w:rPr>
-                <w:sz w:val="18"/>
-              </w:rPr>
-              <w:t>30</w:t>
-            </w:r>
-          </w:p>
-        </w:tc>
-        <w:tc>
-          <w:tcPr>
-            <w:tcW w:type="dxa" w:w="1972"/>
-          </w:tcPr>
-          <w:p>
-            <w:r>
-              <w:rPr>
-                <w:sz w:val="18"/>
-              </w:rPr>
-              <w:t>260</w:t>
-            </w:r>
-          </w:p>
-        </w:tc>
-      </w:tr>
-      <w:tr>
-        <w:trPr>
-          <w:cantSplit/>
-        </w:trPr>
-        <w:tc>
-          <w:tcPr>
-            <w:tcW w:type="dxa" w:w="1972"/>
-          </w:tcPr>
-          <w:p>
-            <w:r>
-              <w:rPr>
-                <w:sz w:val="18"/>
-              </w:rPr>
-              <w:t>Партия 3</w:t>
-            </w:r>
-          </w:p>
-        </w:tc>
-        <w:tc>
-          <w:tcPr>
-            <w:tcW w:type="dxa" w:w="1972"/>
-          </w:tcPr>
-          <w:p>
-            <w:r>
-              <w:rPr>
-                <w:sz w:val="18"/>
-              </w:rPr>
-              <w:t>1250</w:t>
-            </w:r>
-          </w:p>
-        </w:tc>
-        <w:tc>
-          <w:tcPr>
-            <w:tcW w:type="dxa" w:w="1972"/>
-          </w:tcPr>
-          <w:p>
-            <w:r>
-              <w:rPr>
-                <w:sz w:val="18"/>
-              </w:rPr>
-              <w:t>1200</w:t>
-            </w:r>
-          </w:p>
-        </w:tc>
-        <w:tc>
-          <w:tcPr>
-            <w:tcW w:type="dxa" w:w="1972"/>
-          </w:tcPr>
-          <w:p>
-            <w:r>
-              <w:rPr>
-                <w:sz w:val="18"/>
-              </w:rPr>
-              <w:t>25</w:t>
-            </w:r>
-          </w:p>
-        </w:tc>
-        <w:tc>
-          <w:tcPr>
-            <w:tcW w:type="dxa" w:w="1972"/>
-          </w:tcPr>
-          <w:p>
-            <w:r>
-              <w:rPr>
-                <w:sz w:val="18"/>
-              </w:rPr>
-              <w:t>240</w:t>
-            </w:r>
-          </w:p>
-        </w:tc>
-      </w:tr>
-      <w:tr>
-        <w:trPr>
-          <w:cantSplit/>
-        </w:trPr>
-        <w:tc>
-          <w:tcPr>
-            <w:tcW w:type="dxa" w:w="1972"/>
-          </w:tcPr>
-          <w:p>
-            <w:r>
-              <w:rPr>
-                <w:sz w:val="18"/>
-              </w:rPr>
-              <w:t>Партия 4</w:t>
-            </w:r>
-          </w:p>
-        </w:tc>
-        <w:tc>
-          <w:tcPr>
-            <w:tcW w:type="dxa" w:w="1972"/>
-          </w:tcPr>
-          <w:p>
-            <w:r>
-              <w:rPr>
-                <w:sz w:val="18"/>
-              </w:rPr>
-              <w:t>900</w:t>
-            </w:r>
-          </w:p>
-        </w:tc>
-        <w:tc>
-          <w:tcPr>
-            <w:tcW w:type="dxa" w:w="1972"/>
-          </w:tcPr>
-          <w:p>
-            <w:r>
-              <w:rPr>
-                <w:sz w:val="18"/>
-              </w:rPr>
-              <w:t>950</w:t>
-            </w:r>
-          </w:p>
-        </w:tc>
-        <w:tc>
-          <w:tcPr>
-            <w:tcW w:type="dxa" w:w="1972"/>
-          </w:tcPr>
-          <w:p>
-            <w:r>
-              <w:rPr>
-                <w:sz w:val="18"/>
-              </w:rPr>
-              <w:t>45</w:t>
-            </w:r>
-          </w:p>
-        </w:tc>
-        <w:tc>
-          <w:tcPr>
-            <w:tcW w:type="dxa" w:w="1972"/>
-          </w:tcPr>
-          <w:p>
-            <w:r>
-              <w:rPr>
-                <w:sz w:val="18"/>
-              </w:rPr>
-              <w:t>270</w:t>
-            </w:r>
-          </w:p>
-        </w:tc>
-      </w:tr>
-      <w:tr>
-        <w:trPr>
-          <w:cantSplit/>
-        </w:trPr>
-        <w:tc>
-          <w:tcPr>
-            <w:tcW w:type="dxa" w:w="1972"/>
-          </w:tcPr>
-          <w:p>
-            <w:r>
-              <w:rPr>
-                <w:sz w:val="18"/>
-              </w:rPr>
-              <w:t>Партия 5</w:t>
-            </w:r>
-          </w:p>
-        </w:tc>
-        <w:tc>
-          <w:tcPr>
-            <w:tcW w:type="dxa" w:w="1972"/>
-          </w:tcPr>
-          <w:p>
-            <w:r>
-              <w:rPr>
-                <w:sz w:val="18"/>
-              </w:rPr>
-              <w:t>1500</w:t>
-            </w:r>
-          </w:p>
-        </w:tc>
-        <w:tc>
-          <w:tcPr>
-            <w:tcW w:type="dxa" w:w="1972"/>
-          </w:tcPr>
-          <w:p>
-            <w:r>
-              <w:rPr>
-                <w:sz w:val="18"/>
-              </w:rPr>
-              <w:t>1400</w:t>
-            </w:r>
-          </w:p>
-        </w:tc>
-        <w:tc>
-          <w:tcPr>
-            <w:tcW w:type="dxa" w:w="1972"/>
-          </w:tcPr>
-          <w:p>
-            <w:r>
-              <w:rPr>
-                <w:sz w:val="18"/>
-              </w:rPr>
-              <w:t>15</w:t>
-            </w:r>
-          </w:p>
-        </w:tc>
-        <w:tc>
-          <w:tcPr>
-            <w:tcW w:type="dxa" w:w="1972"/>
-          </w:tcPr>
-          <w:p>
-            <w:r>
-              <w:rPr>
-                <w:sz w:val="18"/>
-              </w:rPr>
-              <w:t>230</w:t>
-            </w:r>
-          </w:p>
-        </w:tc>
-      </w:tr>
-    </w:tbl>
-    <w:p>
-      <w:r>
-        <w:t>Процент выполнения плана: 110%; 98%; 104,17%; 94,74%; 107,14%. Стоимостные отклонения: 20 000; −13 000; 6 000; −25 650; 19 550 ₽. Среднее процентов брака — 2,5759%, взвешенный процент — 2,3560%. Эти показатели не взаимозаменяемы: первый одинаково учитывает партии, второй — каждый метр выпуска.</w:t>
-      </w:r>
-    </w:p>
-    <w:p>
-      <w:pPr>
-        <w:pStyle w:val="Heading1"/>
-      </w:pPr>
-      <w:r>
-        <w:t>6. Итоговые варианты 1–5</w:t>
-      </w:r>
-    </w:p>
-    <w:p>
-      <w:r>
-        <w:t>Хотя сценарий предлагает выбрать вариант, для полноты выполнены все пять. В каждом варианте есть не менее трёх разных функций, простые и составные формулы, форматирование, автоматический пересчёт и две диаграммы разных типов с заголовками, легендами и подписями значений.</w:t>
-      </w:r>
-    </w:p>
-    <w:p>
-      <w:pPr>
-        <w:pStyle w:val="Heading2"/>
-      </w:pPr>
-      <w:r>
-        <w:t>Вариант 1. Рабочее время</w:t>
-      </w:r>
-    </w:p>
-    <w:p>
-      <w:r>
-        <w:t>Лист: 13_В1_Рабочее_время</w:t>
-      </w:r>
-    </w:p>
-    <w:p>
-      <w:r>
-        <w:t>Ключевые формулы: F2=МАКС(0;ОСТАТ(D2-C2;1)*24-E2); H2=ОКРУГЛ(F2*G2;2); СУММ; СРЗНАЧ</w:t>
-      </w:r>
-    </w:p>
-    <w:p>
-      <w:r>
-        <w:t>Результат: 39 ч; начислено 14,880 ₽</w:t>
-      </w:r>
-    </w:p>
-    <w:p>
-      <w:r>
-        <w:t>Сидоров: ночная смена 22:00–06:00, 7,5 оплачиваемых часа. Диаграммы: столбчатая часов и круговая зарплаты.</w:t>
-      </w:r>
-    </w:p>
-    <w:p>
-      <w:pPr>
-        <w:pStyle w:val="Heading2"/>
-      </w:pPr>
-      <w:r>
-        <w:t>Вариант 2. Склад</w:t>
-      </w:r>
-    </w:p>
-    <w:p>
-      <w:r>
-        <w:t>Лист: 14_В2_Склад</w:t>
-      </w:r>
-    </w:p>
-    <w:p>
-      <w:r>
-        <w:t>Ключевые формулы: F2=C2+D2-E2; H2=ЕСЛИ(F2&lt;=G2;"Пополнить";"Достаточно"); I2=МАКС(0;G2-F2); СЧЁТЕСЛИ; СУММ</w:t>
-      </w:r>
-    </w:p>
-    <w:p>
-      <w:r>
-        <w:t>Результат: Остаток 810 м; 3 позиции требуют пополнения; закупка 90 м</w:t>
-      </w:r>
-    </w:p>
-    <w:p>
-      <w:r>
-        <w:t>Нужно пополнить хлопок на 50 м, шёлк на 20 м, подкладку на 20 м. Диаграммы: сравнение остатков с минимумом и структура запасов.</w:t>
-      </w:r>
-    </w:p>
-    <w:p>
-      <w:pPr>
-        <w:pStyle w:val="Heading2"/>
-      </w:pPr>
-      <w:r>
-        <w:t>Вариант 3. Производство</w:t>
-      </w:r>
-    </w:p>
-    <w:p>
-      <w:r>
-        <w:t>Лист: 15_В3_Производство</w:t>
-      </w:r>
-    </w:p>
-    <w:p>
-      <w:r>
-        <w:t>Ключевые формулы: E2=C2-D2; F2=ЕСЛИОШИБКА(E2/B2;0); G2=ЕСЛИОШИБКА(D2/C2;0); ЕСЛИ; СУММ</w:t>
-      </w:r>
-    </w:p>
-    <w:p>
-      <w:r>
-        <w:t>Результат: Годный выпуск 1 652 шт.; выполнение 98,92%; брак 1,67%</w:t>
-      </w:r>
-    </w:p>
-    <w:p>
-      <w:r>
-        <w:t>По годному выпуску план выполнен только по джинсам. При нулевом знаменателе доля показывается как 0 (учебная договорённость).</w:t>
-      </w:r>
-    </w:p>
-    <w:p>
-      <w:pPr>
-        <w:pStyle w:val="Heading2"/>
-      </w:pPr>
-      <w:r>
-        <w:t>Вариант 4. Доставка</w:t>
-      </w:r>
-    </w:p>
-    <w:p>
-      <w:r>
-        <w:t>Лист: 16_В4_Доставка</w:t>
-      </w:r>
-    </w:p>
-    <w:p>
-      <w:r>
-        <w:t>Ключевые формулы: E2=B2*C2*D2; G2=ОКРУГЛ(E2*F2/100;2); H2=ОКРУГЛ(G2*$L$2;2); I2=E2*$M$2; СУММ; ЕСЛИОШИБКА</w:t>
-      </w:r>
-    </w:p>
-    <w:p>
-      <w:r>
-        <w:t>Результат: 830 км; 88.1 л; 15,686.50 ₽</w:t>
-      </w:r>
-    </w:p>
-    <w:p>
-      <w:r>
-        <w:t>Два типа диаграмм, редактируемые общие тарифы и абсолютные ссылки.</w:t>
-      </w:r>
-    </w:p>
-    <w:p>
-      <w:pPr>
-        <w:pStyle w:val="Heading2"/>
-      </w:pPr>
-      <w:r>
-        <w:t>Вариант 5. Показатели цеха</w:t>
-      </w:r>
-    </w:p>
-    <w:p>
-      <w:r>
-        <w:t>Лист: 17_В5_Показатели_цеха</w:t>
-      </w:r>
-    </w:p>
-    <w:p>
-      <w:r>
-        <w:t>Ключевые формулы: F2=C2*цена себестоимости; G2=E2*цена продажи; H2=G2-F2; I2=ЕСЛИОШИБКА(H2/F2;0); ЕСЛИ; И; СУММ; СЧЁТЕСЛИ</w:t>
-      </w:r>
-    </w:p>
-    <w:p>
-      <w:r>
-        <w:t>Результат: Затраты 813,000 ₽; выручка 1,874,900 ₽; прибыль 1,061,900 ₽; рентабельность 130.62%</w:t>
-      </w:r>
-    </w:p>
-    <w:p>
-      <w:r>
-        <w:t>Прибыль ниже исходной на 32 100 ₽ из-за непроданного брака. Доля брака платьев превышает 2%; по годному выпуску план не выполнен у платьев, футболок и юбок. Рекомендации: проверить качество платьев и устранить причины недовыпуска. Увеличивать выпуск следует только с учётом спроса и мощности.</w:t>
-      </w:r>
-    </w:p>
-    <w:p>
-      <w:pPr>
-        <w:pStyle w:val="Heading1"/>
-      </w:pPr>
-      <w:r>
-        <w:t>7. Проверка требований, ошибки и выводы</w:t>
-      </w:r>
-    </w:p>
-    <w:tbl>
-      <w:tblPr>
-        <w:tblStyle w:val="LightShading-Accent1"/>
-        <w:tblW w:type="auto" w:w="0"/>
-        <w:tblLook w:firstColumn="1" w:firstRow="1" w:lastColumn="0" w:lastRow="0" w:noHBand="0" w:noVBand="1" w:val="04A0"/>
-      </w:tblPr>
-      <w:tblGrid>
-        <w:gridCol w:w="4929"/>
-        <w:gridCol w:w="4929"/>
-      </w:tblGrid>
-      <w:tr>
-        <w:trPr>
-          <w:cantSplit/>
-        </w:trPr>
-        <w:tc>
-          <w:tcPr>
-            <w:tcW w:type="dxa" w:w="4929"/>
-          </w:tcPr>
-          <w:p>
-            <w:r>
-              <w:rPr>
-                <w:sz w:val="18"/>
-              </w:rPr>
-              <w:t>Требование</w:t>
-            </w:r>
-          </w:p>
-        </w:tc>
-        <w:tc>
-          <w:tcPr>
-            <w:tcW w:type="dxa" w:w="4929"/>
-          </w:tcPr>
-          <w:p>
-            <w:r>
-              <w:rPr>
-                <w:sz w:val="18"/>
-              </w:rPr>
-              <w:t>Реализация</w:t>
-            </w:r>
-          </w:p>
-        </w:tc>
-      </w:tr>
-      <w:tr>
-        <w:trPr>
-          <w:cantSplit/>
-        </w:trPr>
-        <w:tc>
-          <w:tcPr>
-            <w:tcW w:type="dxa" w:w="4929"/>
-          </w:tcPr>
-          <w:p>
-            <w:r>
-              <w:rPr>
-                <w:sz w:val="18"/>
-              </w:rPr>
-              <w:t>Единая книга, отдельные листы</w:t>
-            </w:r>
-          </w:p>
-        </w:tc>
-        <w:tc>
-          <w:tcPr>
-            <w:tcW w:type="dxa" w:w="4929"/>
-          </w:tcPr>
-          <w:p>
-            <w:r>
-              <w:rPr>
-                <w:sz w:val="18"/>
-              </w:rPr>
-              <w:t>18 листов: навигация, отчёт, 7 задач, 4 самостоятельные, 5 вариантов.</w:t>
-            </w:r>
-          </w:p>
-        </w:tc>
-      </w:tr>
-      <w:tr>
-        <w:trPr>
-          <w:cantSplit/>
-        </w:trPr>
-        <w:tc>
-          <w:tcPr>
-            <w:tcW w:type="dxa" w:w="4929"/>
-          </w:tcPr>
-          <w:p>
-            <w:r>
-              <w:rPr>
-                <w:sz w:val="18"/>
-              </w:rPr>
-              <w:t>Не менее трёх функций в каждом варианте</w:t>
-            </w:r>
-          </w:p>
-        </w:tc>
-        <w:tc>
-          <w:tcPr>
-            <w:tcW w:type="dxa" w:w="4929"/>
-          </w:tcPr>
-          <w:p>
-            <w:r>
-              <w:rPr>
-                <w:sz w:val="18"/>
-              </w:rPr>
-              <w:t>В1: MAX, MOD, ROUND, SUM, AVERAGE; В2: IF, MAX, COUNTIF, SUM; В3: IFERROR, IF, SUM; В4: ROUND, SUM, IFERROR; В5: IFERROR, IF, AND, SUM, COUNTIF.</w:t>
-            </w:r>
-          </w:p>
-        </w:tc>
-      </w:tr>
-      <w:tr>
-        <w:trPr>
-          <w:cantSplit/>
-        </w:trPr>
-        <w:tc>
-          <w:tcPr>
-            <w:tcW w:type="dxa" w:w="4929"/>
-          </w:tcPr>
-          <w:p>
-            <w:r>
-              <w:rPr>
-                <w:sz w:val="18"/>
-              </w:rPr>
-              <w:t>Ссылки</w:t>
-            </w:r>
-          </w:p>
-        </w:tc>
-        <w:tc>
-          <w:tcPr>
-            <w:tcW w:type="dxa" w:w="4929"/>
-          </w:tcPr>
-          <w:p>
-            <w:r>
-              <w:rPr>
-                <w:sz w:val="18"/>
-              </w:rPr>
-              <w:t>Относительные ссылки в строках расчётов; абсолютные $B$5, $B$2:$B$3, $L$2, $M$2, $N$2; межлистовые ссылки в варианте 5.</w:t>
-            </w:r>
-          </w:p>
-        </w:tc>
-      </w:tr>
-      <w:tr>
-        <w:trPr>
-          <w:cantSplit/>
-        </w:trPr>
-        <w:tc>
-          <w:tcPr>
-            <w:tcW w:type="dxa" w:w="4929"/>
-          </w:tcPr>
-          <w:p>
-            <w:r>
-              <w:rPr>
-                <w:sz w:val="18"/>
-              </w:rPr>
-              <w:t>Диаграммы</w:t>
-            </w:r>
-          </w:p>
-        </w:tc>
-        <w:tc>
-          <w:tcPr>
-            <w:tcW w:type="dxa" w:w="4929"/>
-          </w:tcPr>
-          <w:p>
-            <w:r>
-              <w:rPr>
-                <w:sz w:val="18"/>
-              </w:rPr>
-              <w:t>Всего 13 встроенных диаграмм: 2 в отчёте, 1 для продаж и по 2 в каждом итоговом варианте. Основная пара — столбчатая и круговая.</w:t>
-            </w:r>
-          </w:p>
-        </w:tc>
-      </w:tr>
-      <w:tr>
-        <w:trPr>
-          <w:cantSplit/>
-        </w:trPr>
-        <w:tc>
-          <w:tcPr>
-            <w:tcW w:type="dxa" w:w="4929"/>
-          </w:tcPr>
-          <w:p>
-            <w:r>
-              <w:rPr>
-                <w:sz w:val="18"/>
-              </w:rPr>
-              <w:t>Автоматизация и оформление</w:t>
-            </w:r>
-          </w:p>
-        </w:tc>
-        <w:tc>
-          <w:tcPr>
-            <w:tcW w:type="dxa" w:w="4929"/>
-          </w:tcPr>
-          <w:p>
-            <w:r>
-              <w:rPr>
-                <w:sz w:val="18"/>
-              </w:rPr>
-              <w:t>Автоматический режим вычислений, сохранённые начальные результаты формул, выделение входных и расчётных ячеек, подсветка нарушений, проверка списков для подписки и сегмента.</w:t>
-            </w:r>
-          </w:p>
-        </w:tc>
-      </w:tr>
-      <w:tr>
-        <w:trPr>
-          <w:cantSplit/>
-        </w:trPr>
-        <w:tc>
-          <w:tcPr>
-            <w:tcW w:type="dxa" w:w="4929"/>
-          </w:tcPr>
-          <w:p>
-            <w:r>
-              <w:rPr>
-                <w:sz w:val="18"/>
-              </w:rPr>
-              <w:t>Проверка результатов</w:t>
-            </w:r>
-          </w:p>
-        </w:tc>
-        <w:tc>
-          <w:tcPr>
-            <w:tcW w:type="dxa" w:w="4929"/>
-          </w:tcPr>
-          <w:p>
-            <w:r>
-              <w:rPr>
-                <w:sz w:val="18"/>
-              </w:rPr>
-              <w:t>Контроль арифметики, дат, количества листов и диаграмм; граничные примеры скидки, доступа, качества и пятницы. Проверка файлов программно; интерактивное открытие в настольном Excel/Word не выполнялось.</w:t>
+              <w:t>Среднее 176,25 тыс. ₽; максимум — декабрь, 300 тыс. ₽; выше среднего — 6 месяцев</w:t>
             </w:r>
           </w:p>
         </w:tc>
@@ -1949,12 +537,27 @@
         <w:pStyle w:val="Heading2"/>
       </w:pPr>
       <w:r>
-        <w:t>Какие функции использовались чаще и почему?</w:t>
+        <w:t>3. Самостоятельные задачи</w:t>
       </w:r>
     </w:p>
     <w:p>
       <w:r>
-        <w:t>СУММ, ЕСЛИ, СРЗНАЧ и ЕСЛИОШИБКА: они дают итоги, проверяют условия, сравнивают показатели и обрабатывают недопустимое деление. ИНДЕКС и ПОИСКПОЗ позволяют получить название объекта с максимальным значением.</w:t>
+        <w:t>1. Стоимость: ОКРУГЛ(3,5 × 1200 × 250 × 1,2; 2) = 1 260 000 ₽ с НДС; без НДС — 1 050 000 ₽.</w:t>
+      </w:r>
+    </w:p>
+    <w:p>
+      <w:r>
+        <w:t>2. Качество: ЕСЛИ(И(A2&gt;=50;ИЛИ(B2&lt;=5;C2="Массмаркет"));"Годна";"Брак"). Для примеров 55 / 4 / Премиум — «Годна»; 48 / 3 / Массмаркет — «Брак».</w:t>
+      </w:r>
+    </w:p>
+    <w:p>
+      <w:r>
+        <w:t>3. Срок: РАБДЕНЬ.МЕЖД(A2;C2;1;$B$2:$B$3). От 10.06.2025 за 15 рабочих дней, исключая 12 и 13 июня: 03.07.2025.</w:t>
+      </w:r>
+    </w:p>
+    <w:p>
+      <w:r>
+        <w:t>4. Пять учебных партий: средний брак 2,5759%; наибольшее стоимостное отклонение — партия 1, +20 000 ₽; выборочное стандартное отклонение себестоимости — 15,8114 ₽/м.</w:t>
       </w:r>
     </w:p>
     <w:p>
@@ -1962,12 +565,155 @@
         <w:pStyle w:val="Heading2"/>
       </w:pPr>
       <w:r>
-        <w:t>Какие ошибки бывают и как их избежать?</w:t>
+        <w:t>4. Итоговые варианты</w:t>
       </w:r>
     </w:p>
+    <w:tbl>
+      <w:tblPr>
+        <w:tblStyle w:val="TableGrid"/>
+        <w:tblW w:type="auto" w:w="0"/>
+        <w:tblLook w:firstColumn="1" w:firstRow="1" w:lastColumn="0" w:lastRow="0" w:noHBand="0" w:noVBand="1" w:val="04A0"/>
+      </w:tblPr>
+      <w:tblGrid>
+        <w:gridCol w:w="4986"/>
+        <w:gridCol w:w="4986"/>
+      </w:tblGrid>
+      <w:tr>
+        <w:tc>
+          <w:tcPr>
+            <w:tcW w:type="dxa" w:w="4986"/>
+          </w:tcPr>
+          <w:p>
+            <w:r>
+              <w:t>Вариант</w:t>
+            </w:r>
+          </w:p>
+        </w:tc>
+        <w:tc>
+          <w:tcPr>
+            <w:tcW w:type="dxa" w:w="4986"/>
+          </w:tcPr>
+          <w:p>
+            <w:r>
+              <w:t>Основной результат</w:t>
+            </w:r>
+          </w:p>
+        </w:tc>
+      </w:tr>
+      <w:tr>
+        <w:tc>
+          <w:tcPr>
+            <w:tcW w:type="dxa" w:w="4986"/>
+          </w:tcPr>
+          <w:p>
+            <w:r>
+              <w:t>1. Рабочее время</w:t>
+            </w:r>
+          </w:p>
+        </w:tc>
+        <w:tc>
+          <w:tcPr>
+            <w:tcW w:type="dxa" w:w="4986"/>
+          </w:tcPr>
+          <w:p>
+            <w:r>
+              <w:t>39 ч; начисленная зарплата 14 880 ₽. Учтена смена через полночь.</w:t>
+            </w:r>
+          </w:p>
+        </w:tc>
+      </w:tr>
+      <w:tr>
+        <w:tc>
+          <w:tcPr>
+            <w:tcW w:type="dxa" w:w="4986"/>
+          </w:tcPr>
+          <w:p>
+            <w:r>
+              <w:t>2. Склад</w:t>
+            </w:r>
+          </w:p>
+        </w:tc>
+        <w:tc>
+          <w:tcPr>
+            <w:tcW w:type="dxa" w:w="4986"/>
+          </w:tcPr>
+          <w:p>
+            <w:r>
+              <w:t>Остаток 810 м; пополнить 3 позиции, всего на 90 м.</w:t>
+            </w:r>
+          </w:p>
+        </w:tc>
+      </w:tr>
+      <w:tr>
+        <w:tc>
+          <w:tcPr>
+            <w:tcW w:type="dxa" w:w="4986"/>
+          </w:tcPr>
+          <w:p>
+            <w:r>
+              <w:t>3. Производство</w:t>
+            </w:r>
+          </w:p>
+        </w:tc>
+        <w:tc>
+          <w:tcPr>
+            <w:tcW w:type="dxa" w:w="4986"/>
+          </w:tcPr>
+          <w:p>
+            <w:r>
+              <w:t>Годный выпуск 1 652 шт.; выполнение 98,92%; брак 1,67%.</w:t>
+            </w:r>
+          </w:p>
+        </w:tc>
+      </w:tr>
+      <w:tr>
+        <w:tc>
+          <w:tcPr>
+            <w:tcW w:type="dxa" w:w="4986"/>
+          </w:tcPr>
+          <w:p>
+            <w:r>
+              <w:t>4. Доставка</w:t>
+            </w:r>
+          </w:p>
+        </w:tc>
+        <w:tc>
+          <w:tcPr>
+            <w:tcW w:type="dxa" w:w="4986"/>
+          </w:tcPr>
+          <w:p>
+            <w:r>
+              <w:t>830 км; топливо 88,1 л; стоимость 15 686,50 ₽.</w:t>
+            </w:r>
+          </w:p>
+        </w:tc>
+      </w:tr>
+      <w:tr>
+        <w:tc>
+          <w:tcPr>
+            <w:tcW w:type="dxa" w:w="4986"/>
+          </w:tcPr>
+          <w:p>
+            <w:r>
+              <w:t>5. Показатели цеха</w:t>
+            </w:r>
+          </w:p>
+        </w:tc>
+        <w:tc>
+          <w:tcPr>
+            <w:tcW w:type="dxa" w:w="4986"/>
+          </w:tcPr>
+          <w:p>
+            <w:r>
+              <w:t>Затраты 813 000 ₽; выручка 1 874 900 ₽; прибыль 1 061 900 ₽; рентабельность затрат 130,62%.</w:t>
+            </w:r>
+          </w:p>
+        </w:tc>
+      </w:tr>
+    </w:tbl>
     <w:p>
       <w:r>
-        <w:t>Неверные диапазоны и сдвиг ссылок; отсутствие знака =; неверный разделитель аргументов; текст вместо числа или даты (#ЗНАЧ!); деление на ноль (#ДЕЛ/0!); неверное имя функции (#ИМЯ?); удалённые ссылки (#ССЫЛКА!). Нужно проверять типы данных, скобки, ссылки и граничные условия. ЕСЛИОШИБКА применяют осознанно, не для сокрытия неверных данных.</w:t>
+        <w:t>В каждом варианте использовано не менее трёх разных функций и две диаграммы разных типов. Формулы пересчитываются при изменении исходных данных. В варианте 5 показатели связаны с листами производства и цен.</w:t>
       </w:r>
     </w:p>
     <w:p>
@@ -1975,12 +721,62 @@
         <w:pStyle w:val="Heading2"/>
       </w:pPr>
       <w:r>
-        <w:t>Как функции упрощают профессиональную работу?</w:t>
+        <w:t>5. Короткие ответы на вопросы</w:t>
       </w:r>
     </w:p>
     <w:p>
       <w:r>
-        <w:t>Один раз построенная модель пересчитывает зарплату, запасы, себестоимость, сроки и производственные показатели после изменения входных данных. Это экономит время и позволяет проверять решения на нескольких сценариях.</w:t>
+        <w:t>• Информация — сведения об объектах и процессах. Формы: текстовая, числовая, графическая, звуковая и видео. В работе использована табличная форма.</w:t>
+      </w:r>
+    </w:p>
+    <w:p>
+      <w:r>
+        <w:t>• Таблица удобнее сплошного текста для поиска, сравнения и вычислений. Чтобы преобразовать текст в таблицу, выделяют объекты (строки) и свойства (столбцы).</w:t>
+      </w:r>
+    </w:p>
+    <w:p>
+      <w:r>
+        <w:t>• Структура: книга → лист → строки и столбцы → ячейки и диапазоны. В ячейки вводят текст, числа, даты, время, логические значения и формулы.</w:t>
+      </w:r>
+    </w:p>
+    <w:p>
+      <w:r>
+        <w:t>• Создать таблицу — задать структуру, ввести данные и формулы. В отличие от таблицы в тексте она автоматически пересчитывает результаты.</w:t>
+      </w:r>
+    </w:p>
+    <w:p>
+      <w:r>
+        <w:t>• Формула начинается с =. Операторы: +, −, *, /, ^. Копирование: маркер заполнения или Ctrl+C/Ctrl+V. Относительная ссылка меняется, абсолютная ($L$2) фиксируется.</w:t>
+      </w:r>
+    </w:p>
+    <w:p>
+      <w:r>
+        <w:t>• Числовой формат округляет только отображение; ОКРУГЛ — результат. Для юбок точное выполнение плана 95,74468…%, на листе отчёта показано 96.</w:t>
+      </w:r>
+    </w:p>
+    <w:p>
+      <w:r>
+        <w:t>• Категории функций: математические, статистические, логические, текстовые, дата/время, ссылки и массивы, базы данных. Чаще нужны СУММ, СРЗНАЧ и ЕСЛИ для итогов и проверок.</w:t>
+      </w:r>
+    </w:p>
+    <w:p>
+      <w:r>
+        <w:t>• Типичные ошибки: неверные ссылки, текст вместо числа, пропущенные скобки, деление на ноль. Нужно проверять диапазоны, типы данных и граничные случаи; ЕСЛИОШИБКА не заменяет проверку исходных данных.</w:t>
+      </w:r>
+    </w:p>
+    <w:p>
+      <w:r>
+        <w:t>• Применение: личный бюджет, сравнение цен, зарплата, склад, сметы, сроки заказов и логистика. Автоматизация экономит время и сокращает повторный ввод.</w:t>
+      </w:r>
+    </w:p>
+    <w:p>
+      <w:r>
+        <w:t>• Освоены ввод и организация данных, формулы, функции, копирование, форматирование чисел, диаграммы и анализ результатов.</w:t>
+      </w:r>
+    </w:p>
+    <w:p>
+      <w:r>
+        <w:t>• Структура зависит от задачи, пользователей и объёма данных. Принципы: одна строка на объект, понятные единицы, разделение ввода и расчётов. Учёт фиксирует события; анализ выявляет отклонения и помогает принимать решения.</w:t>
       </w:r>
     </w:p>
     <w:p>
@@ -1988,455 +784,37 @@
         <w:pStyle w:val="Heading2"/>
       </w:pPr>
       <w:r>
-        <w:t>Какие операции освоены?</w:t>
+        <w:t>Примечания и вывод</w:t>
       </w:r>
     </w:p>
     <w:p>
       <w:r>
-        <w:t>Создание и оформление таблиц, ввод текста/чисел/дат, вычисления и копирование формул, применение функций, относительных/абсолютных ссылок, форматирование чисел, условное форматирование, расчёт итогов и построение диаграмм.</w:t>
-      </w:r>
-    </w:p>
-    <w:p>
-      <w:pPr>
-        <w:pStyle w:val="Heading2"/>
-      </w:pPr>
-      <w:r>
-        <w:t>Как структура таблицы влияет на эффективность?</w:t>
+        <w:t>Данные, отсутствующие в условии, выбраны как учебные. В задаче качества исправлены адреса ячеек; прочность обязательна для обоих сегментов. В РАБДЕНЬ.МЕЖД добавлен пропущенный аргумент выходных. В обеих задачах 5–6 используются рабочие дни. Календарь заказа: пятидневка РФ, 12 и 13 июня 2025 исключены.</w:t>
       </w:r>
     </w:p>
     <w:p>
       <w:r>
-        <w:t>Одна строка на объект и один тип данных на столбец облегчают проверку и расширение. Разделение входных данных, расчётов и отчётов предотвращает повторный ручной ввод и позволяет адаптировать таблицу к новым задачам.</w:t>
-      </w:r>
-    </w:p>
-    <w:p>
-      <w:pPr>
-        <w:pStyle w:val="Heading2"/>
-      </w:pPr>
-      <w:r>
-        <w:t>Какие принципы использованы при проектировании?</w:t>
+        <w:t>«Рентабельность» пяти партий по формуле сценария — стоимостное отклонение, не процент прибыли. В варианте 5 рентабельность = прибыль / затраты. Прибыль рассчитана при продаже всего годного выпуска.</w:t>
       </w:r>
     </w:p>
     <w:p>
       <w:r>
-        <w:t>Понятные заголовки и единицы, единый формат, модульность, отдельно изменяемые параметры, формулы вместо ручных итогов, ключевые показатели и диаграммы. Структура зависит от назначения, пользователей, типа и объёма данных.</w:t>
-      </w:r>
-    </w:p>
-    <w:p>
-      <w:pPr>
-        <w:pStyle w:val="Heading2"/>
-      </w:pPr>
-      <w:r>
-        <w:t>Чем отличаются учётные и аналитические таблицы?</w:t>
+        <w:t>По просьбе пользователя Excel оформлен без декоративных стилей и цветовых выделений. Пятница и минимальные запасы обозначены текстом; цветовая подсветка из исходного сценария снята. Форматы чисел, дат и времени сохранены.</w:t>
       </w:r>
     </w:p>
     <w:p>
       <w:r>
-        <w:t>Учётные фиксируют отдельные события и требуют удобного, точного ввода. Аналитические агрегируют данные, рассчитывают доли и отклонения, показывают тенденции для принятия решений. Они должны быть связаны формулами с исходными записями, а не содержать несогласованные копии.</w:t>
+        <w:t>Вывод: общий план цеха перевыполнен, но отдельные позиции отстают. Учёт брака снижает годный выпуск и прибыль, поэтому оценивать нужно одновременно объём, качество и затраты. Файлы проверены программно; настольные Excel и Word не запускались.</w:t>
       </w:r>
     </w:p>
-    <w:p>
-      <w:pPr>
-        <w:pStyle w:val="Heading2"/>
-      </w:pPr>
-      <w:r>
-        <w:t>Итоговый вывод</w:t>
-      </w:r>
-    </w:p>
-    <w:p>
-      <w:r>
-        <w:t>Электронные таблицы позволяют превратить текстовый отчёт в проверяемую расчётную модель. По исходным данным цех в целом выполнил количественный план, но недовыпуск отдельных изделий требует внимания. В расширенной модели учёт брака снижает годный выпуск до 1 652 шт. и прибыль до 1 061 900 ₽. Для управленческого решения необходимо анализировать одновременно объём, качество и затраты, а не только общую сумму выпуска.</w:t>
-      </w:r>
-    </w:p>
-    <w:p>
-      <w:pPr>
-        <w:pStyle w:val="Heading1"/>
-      </w:pPr>
-      <w:r>
-        <w:t>Приложение. Соответствие скриншотов результатам</w:t>
-      </w:r>
-    </w:p>
-    <w:p>
-      <w:r>
-        <w:t>Все имена начинаются с «Снимок экрана 2026-10-23». Ниже приведены окончания имён; диапазоны включают имеющиеся файлы между указанными отметками.</w:t>
-      </w:r>
-    </w:p>
-    <w:tbl>
-      <w:tblPr>
-        <w:tblStyle w:val="LightShading-Accent1"/>
-        <w:tblW w:type="auto" w:w="0"/>
-        <w:tblLook w:firstColumn="1" w:firstRow="1" w:lastColumn="0" w:lastRow="0" w:noHBand="0" w:noVBand="1" w:val="04A0"/>
-      </w:tblPr>
-      <w:tblGrid>
-        <w:gridCol w:w="4929"/>
-        <w:gridCol w:w="4929"/>
-      </w:tblGrid>
-      <w:tr>
-        <w:trPr>
-          <w:cantSplit/>
-        </w:trPr>
-        <w:tc>
-          <w:tcPr>
-            <w:tcW w:type="dxa" w:w="4929"/>
-          </w:tcPr>
-          <w:p>
-            <w:r>
-              <w:rPr>
-                <w:sz w:val="18"/>
-              </w:rPr>
-              <w:t>Скриншоты</w:t>
-            </w:r>
-          </w:p>
-        </w:tc>
-        <w:tc>
-          <w:tcPr>
-            <w:tcW w:type="dxa" w:w="4929"/>
-          </w:tcPr>
-          <w:p>
-            <w:r>
-              <w:rPr>
-                <w:sz w:val="18"/>
-              </w:rPr>
-              <w:t>Выполненная часть</w:t>
-            </w:r>
-          </w:p>
-        </w:tc>
-      </w:tr>
-      <w:tr>
-        <w:trPr>
-          <w:cantSplit/>
-        </w:trPr>
-        <w:tc>
-          <w:tcPr>
-            <w:tcW w:type="dxa" w:w="4929"/>
-          </w:tcPr>
-          <w:p>
-            <w:r>
-              <w:rPr>
-                <w:sz w:val="18"/>
-              </w:rPr>
-              <w:t>132332–132404</w:t>
-            </w:r>
-          </w:p>
-        </w:tc>
-        <w:tc>
-          <w:tcPr>
-            <w:tcW w:type="dxa" w:w="4929"/>
-          </w:tcPr>
-          <w:p>
-            <w:r>
-              <w:rPr>
-                <w:sz w:val="18"/>
-              </w:rPr>
-              <w:t>Ответы на вводные вопросы, структура отчёта, вычисления и выводы; лист 01 и разделы 2–3.</w:t>
-            </w:r>
-          </w:p>
-        </w:tc>
-      </w:tr>
-      <w:tr>
-        <w:trPr>
-          <w:cantSplit/>
-        </w:trPr>
-        <w:tc>
-          <w:tcPr>
-            <w:tcW w:type="dxa" w:w="4929"/>
-          </w:tcPr>
-          <w:p>
-            <w:r>
-              <w:rPr>
-                <w:sz w:val="18"/>
-              </w:rPr>
-              <w:t>132422–132438</w:t>
-            </w:r>
-          </w:p>
-        </w:tc>
-        <w:tc>
-          <w:tcPr>
-            <w:tcW w:type="dxa" w:w="4929"/>
-          </w:tcPr>
-          <w:p>
-            <w:r>
-              <w:rPr>
-                <w:sz w:val="18"/>
-              </w:rPr>
-              <w:t>Цель работы, возможности таблиц и примеры применения; разделы 1–2.</w:t>
-            </w:r>
-          </w:p>
-        </w:tc>
-      </w:tr>
-      <w:tr>
-        <w:trPr>
-          <w:cantSplit/>
-        </w:trPr>
-        <w:tc>
-          <w:tcPr>
-            <w:tcW w:type="dxa" w:w="4929"/>
-          </w:tcPr>
-          <w:p>
-            <w:r>
-              <w:rPr>
-                <w:sz w:val="18"/>
-              </w:rPr>
-              <w:t>132442–132622</w:t>
-            </w:r>
-          </w:p>
-        </w:tc>
-        <w:tc>
-          <w:tcPr>
-            <w:tcW w:type="dxa" w:w="4929"/>
-          </w:tcPr>
-          <w:p>
-            <w:r>
-              <w:rPr>
-                <w:sz w:val="18"/>
-              </w:rPr>
-              <w:t>Создание, оформление, формулы, копирование, округление и круговая диаграмма; лист 01.</w:t>
-            </w:r>
-          </w:p>
-        </w:tc>
-      </w:tr>
-      <w:tr>
-        <w:trPr>
-          <w:cantSplit/>
-        </w:trPr>
-        <w:tc>
-          <w:tcPr>
-            <w:tcW w:type="dxa" w:w="4929"/>
-          </w:tcPr>
-          <w:p>
-            <w:r>
-              <w:rPr>
-                <w:sz w:val="18"/>
-              </w:rPr>
-              <w:t>132625–132643</w:t>
-            </w:r>
-          </w:p>
-        </w:tc>
-        <w:tc>
-          <w:tcPr>
-            <w:tcW w:type="dxa" w:w="4929"/>
-          </w:tcPr>
-          <w:p>
-            <w:r>
-              <w:rPr>
-                <w:sz w:val="18"/>
-              </w:rPr>
-              <w:t>Итоговые вопросы и структура электронных таблиц; раздел 2.</w:t>
-            </w:r>
-          </w:p>
-        </w:tc>
-      </w:tr>
-      <w:tr>
-        <w:trPr>
-          <w:cantSplit/>
-        </w:trPr>
-        <w:tc>
-          <w:tcPr>
-            <w:tcW w:type="dxa" w:w="4929"/>
-          </w:tcPr>
-          <w:p>
-            <w:r>
-              <w:rPr>
-                <w:sz w:val="18"/>
-              </w:rPr>
-              <w:t>132647–132657</w:t>
-            </w:r>
-          </w:p>
-        </w:tc>
-        <w:tc>
-          <w:tcPr>
-            <w:tcW w:type="dxa" w:w="4929"/>
-          </w:tcPr>
-          <w:p>
-            <w:r>
-              <w:rPr>
-                <w:sz w:val="18"/>
-              </w:rPr>
-              <w:t>Категории функций; раздел 2.</w:t>
-            </w:r>
-          </w:p>
-        </w:tc>
-      </w:tr>
-      <w:tr>
-        <w:trPr>
-          <w:cantSplit/>
-        </w:trPr>
-        <w:tc>
-          <w:tcPr>
-            <w:tcW w:type="dxa" w:w="4929"/>
-          </w:tcPr>
-          <w:p>
-            <w:r>
-              <w:rPr>
-                <w:sz w:val="18"/>
-              </w:rPr>
-              <w:t>132702–132726</w:t>
-            </w:r>
-          </w:p>
-        </w:tc>
-        <w:tc>
-          <w:tcPr>
-            <w:tcW w:type="dxa" w:w="4929"/>
-          </w:tcPr>
-          <w:p>
-            <w:r>
-              <w:rPr>
-                <w:sz w:val="18"/>
-              </w:rPr>
-              <w:t>Задачи 1–7; листы 02–08, раздел 4.</w:t>
-            </w:r>
-          </w:p>
-        </w:tc>
-      </w:tr>
-      <w:tr>
-        <w:trPr>
-          <w:cantSplit/>
-        </w:trPr>
-        <w:tc>
-          <w:tcPr>
-            <w:tcW w:type="dxa" w:w="4929"/>
-          </w:tcPr>
-          <w:p>
-            <w:r>
-              <w:rPr>
-                <w:sz w:val="18"/>
-              </w:rPr>
-              <w:t>132731–132735</w:t>
-            </w:r>
-          </w:p>
-        </w:tc>
-        <w:tc>
-          <w:tcPr>
-            <w:tcW w:type="dxa" w:w="4929"/>
-          </w:tcPr>
-          <w:p>
-            <w:r>
-              <w:rPr>
-                <w:sz w:val="18"/>
-              </w:rPr>
-              <w:t>Самостоятельные задачи 1–4; листы 09–12, раздел 5; исправления — раздел 1.</w:t>
-            </w:r>
-          </w:p>
-        </w:tc>
-      </w:tr>
-      <w:tr>
-        <w:trPr>
-          <w:cantSplit/>
-        </w:trPr>
-        <w:tc>
-          <w:tcPr>
-            <w:tcW w:type="dxa" w:w="4929"/>
-          </w:tcPr>
-          <w:p>
-            <w:r>
-              <w:rPr>
-                <w:sz w:val="18"/>
-              </w:rPr>
-              <w:t>132740–132748</w:t>
-            </w:r>
-          </w:p>
-        </w:tc>
-        <w:tc>
-          <w:tcPr>
-            <w:tcW w:type="dxa" w:w="4929"/>
-          </w:tcPr>
-          <w:p>
-            <w:r>
-              <w:rPr>
-                <w:sz w:val="18"/>
-              </w:rPr>
-              <w:t>Рефлексия и перечень освоенных операций; раздел 7.</w:t>
-            </w:r>
-          </w:p>
-        </w:tc>
-      </w:tr>
-      <w:tr>
-        <w:trPr>
-          <w:cantSplit/>
-        </w:trPr>
-        <w:tc>
-          <w:tcPr>
-            <w:tcW w:type="dxa" w:w="4929"/>
-          </w:tcPr>
-          <w:p>
-            <w:r>
-              <w:rPr>
-                <w:sz w:val="18"/>
-              </w:rPr>
-              <w:t>132752–132802</w:t>
-            </w:r>
-          </w:p>
-        </w:tc>
-        <w:tc>
-          <w:tcPr>
-            <w:tcW w:type="dxa" w:w="4929"/>
-          </w:tcPr>
-          <w:p>
-            <w:r>
-              <w:rPr>
-                <w:sz w:val="18"/>
-              </w:rPr>
-              <w:t>Все пять вариантов и общие требования; листы 13–17, разделы 6–7.</w:t>
-            </w:r>
-          </w:p>
-        </w:tc>
-      </w:tr>
-      <w:tr>
-        <w:trPr>
-          <w:cantSplit/>
-        </w:trPr>
-        <w:tc>
-          <w:tcPr>
-            <w:tcW w:type="dxa" w:w="4929"/>
-          </w:tcPr>
-          <w:p>
-            <w:r>
-              <w:rPr>
-                <w:sz w:val="18"/>
-              </w:rPr>
-              <w:t>132809–132813</w:t>
-            </w:r>
-          </w:p>
-        </w:tc>
-        <w:tc>
-          <w:tcPr>
-            <w:tcW w:type="dxa" w:w="4929"/>
-          </w:tcPr>
-          <w:p>
-            <w:r>
-              <w:rPr>
-                <w:sz w:val="18"/>
-              </w:rPr>
-              <w:t>Вопросы о структуре, проектировании и назначении таблиц; раздел 7.</w:t>
-            </w:r>
-          </w:p>
-        </w:tc>
-      </w:tr>
-    </w:tbl>
     <w:sectPr>
-      <w:footerReference w:type="default" r:id="rId9"/>
       <w:pgSz w:w="12240" w:h="15840"/>
-      <w:pgMar w:top="1134" w:right="1020" w:bottom="1134" w:left="1361" w:header="720" w:footer="720" w:gutter="0"/>
+      <w:pgMar w:top="964" w:right="1134" w:bottom="964" w:left="1134" w:header="720" w:footer="720" w:gutter="0"/>
       <w:cols w:space="720"/>
       <w:docGrid w:linePitch="360"/>
     </w:sectPr>
   </w:body>
 </w:document>
-</file>
-
-<file path=word/footer1.xml><?xml version="1.0" encoding="utf-8"?>
-<w:ftr xmlns:m="http://schemas.openxmlformats.org/officeDocument/2006/math" xmlns:mc="http://schemas.openxmlformats.org/markup-compatibility/2006" xmlns:mo="http://schemas.microsoft.com/office/mac/office/2008/main" xmlns:mv="urn:schemas-microsoft-com:mac:vml" xmlns:o="urn:schemas-microsoft-com:office:office" xmlns:r="http://schemas.openxmlformats.org/officeDocument/2006/relationships" xmlns:v="urn:schemas-microsoft-com:vml" xmlns:w10="urn:schemas-microsoft-com:office:word" xmlns:w14="http://schemas.microsoft.com/office/word/2010/wordml" xmlns:w="http://schemas.openxmlformats.org/wordprocessingml/2006/main" xmlns:wne="http://schemas.microsoft.com/office/word/2006/wordml" xmlns:wp14="http://schemas.microsoft.com/office/word/2010/wordprocessingDrawing" xmlns:wp="http://schemas.openxmlformats.org/drawingml/2006/wordprocessingDrawing" xmlns:wpc="http://schemas.microsoft.com/office/word/2010/wordprocessingCanvas" xmlns:wpg="http://schemas.microsoft.com/office/word/2010/wordprocessingGroup" xmlns:wpi="http://schemas.microsoft.com/office/word/2010/wordprocessingInk" xmlns:wps="http://schemas.microsoft.com/office/word/2010/wordprocessingShape" mc:Ignorable="w14 wp14">
-  <w:p>
-    <w:pPr>
-      <w:pStyle w:val="Footer"/>
-      <w:jc w:val="right"/>
-    </w:pPr>
-    <w:r>
-      <w:t xml:space="preserve">Электронные таблицы • </w:t>
-    </w:r>
-    <w:fldSimple w:instr="PAGE"/>
-  </w:p>
-</w:ftr>
 </file>
 
 <file path=word/numbering.xml><?xml version="1.0" encoding="utf-8"?>
@@ -2803,7 +1181,7 @@
     <w:qFormat/>
     <w:rsid w:val="00FC693F"/>
     <w:pPr>
-      <w:spacing w:after="120"/>
+      <w:spacing w:after="80"/>
     </w:pPr>
     <w:rPr>
       <w:rFonts w:ascii="Calibri" w:hAnsi="Calibri"/>
@@ -2869,10 +1247,10 @@
       <w:outlineLvl w:val="0"/>
     </w:pPr>
     <w:rPr>
-      <w:rFonts w:asciiTheme="majorHAnsi" w:eastAsiaTheme="majorEastAsia" w:hAnsiTheme="majorHAnsi" w:cstheme="majorBidi" w:ascii="Calibri" w:hAnsi="Calibri"/>
+      <w:rFonts w:asciiTheme="majorHAnsi" w:eastAsiaTheme="majorEastAsia" w:hAnsiTheme="majorHAnsi" w:cstheme="majorBidi"/>
       <w:b/>
       <w:bCs/>
-      <w:color w:val="173A57"/>
+      <w:color w:val="365F91" w:themeColor="accent1" w:themeShade="BF"/>
       <w:sz w:val="28"/>
       <w:szCs w:val="28"/>
     </w:rPr>
@@ -2893,10 +1271,10 @@
       <w:outlineLvl w:val="1"/>
     </w:pPr>
     <w:rPr>
-      <w:rFonts w:asciiTheme="majorHAnsi" w:eastAsiaTheme="majorEastAsia" w:hAnsiTheme="majorHAnsi" w:cstheme="majorBidi" w:ascii="Calibri" w:hAnsi="Calibri"/>
+      <w:rFonts w:asciiTheme="majorHAnsi" w:eastAsiaTheme="majorEastAsia" w:hAnsiTheme="majorHAnsi" w:cstheme="majorBidi"/>
       <w:b/>
       <w:bCs/>
-      <w:color w:val="173A57"/>
+      <w:color w:val="4F81BD" w:themeColor="accent1"/>
       <w:sz w:val="26"/>
       <w:szCs w:val="26"/>
     </w:rPr>
@@ -3158,8 +1536,8 @@
       <w:contextualSpacing/>
     </w:pPr>
     <w:rPr>
-      <w:rFonts w:asciiTheme="majorHAnsi" w:eastAsiaTheme="majorEastAsia" w:hAnsiTheme="majorHAnsi" w:cstheme="majorBidi" w:ascii="Calibri" w:hAnsi="Calibri"/>
-      <w:color w:val="173A57"/>
+      <w:rFonts w:asciiTheme="majorHAnsi" w:eastAsiaTheme="majorEastAsia" w:hAnsiTheme="majorHAnsi" w:cstheme="majorBidi"/>
+      <w:color w:val="17365D" w:themeColor="text2" w:themeShade="BF"/>
       <w:spacing w:val="5"/>
       <w:kern w:val="28"/>
       <w:sz w:val="52"/>

</xml_diff>